<commit_message>
Josh n Mike demo
</commit_message>
<xml_diff>
--- a/_3 Develop/_Design Spec/AR260826 Elevate MLOI HW Design Specs 8-26-26 Draft 3.docx
+++ b/_3 Develop/_Design Spec/AR260826 Elevate MLOI HW Design Specs 8-26-26 Draft 3.docx
@@ -83,6 +83,14 @@
           <w:szCs w:val="24"/>
         </w:rPr>
       </w:pPr>
+      <w:r>
+        <w:rPr>
+          <w:rFonts w:cs="Arial"/>
+          <w:sz w:val="24"/>
+          <w:szCs w:val="24"/>
+        </w:rPr>
+        <w:t xml:space="preserve">ELEVATE </w:t>
+      </w:r>
       <w:r>
         <w:rPr>
           <w:rFonts w:cs="Arial"/>
@@ -1033,14 +1041,7 @@
                 <w:rFonts w:cs="Arial"/>
                 <w:szCs w:val="22"/>
               </w:rPr>
-              <w:t>2025/03/</w:t>
-            </w:r>
-            <w:r>
-              <w:rPr>
-                <w:rFonts w:cs="Arial"/>
-                <w:szCs w:val="22"/>
-              </w:rPr>
-              <w:t>02</w:t>
+              <w:t>2025/03/02</w:t>
             </w:r>
           </w:p>
         </w:tc>
@@ -1097,14 +1098,7 @@
                 <w:rFonts w:cs="Arial"/>
                 <w:szCs w:val="22"/>
               </w:rPr>
-              <w:t xml:space="preserve">Draft </w:t>
-            </w:r>
-            <w:r>
-              <w:rPr>
-                <w:rFonts w:cs="Arial"/>
-                <w:szCs w:val="22"/>
-              </w:rPr>
-              <w:t>2</w:t>
+              <w:t>Draft 2</w:t>
             </w:r>
           </w:p>
         </w:tc>
@@ -5073,7 +5067,19 @@
         <w:rPr>
           <w:szCs w:val="22"/>
         </w:rPr>
-        <w:t xml:space="preserve">Allen 8005571.05 (P&amp;WC </w:t>
+        <w:t xml:space="preserve">Allen </w:t>
+      </w:r>
+      <w:r>
+        <w:rPr>
+          <w:szCs w:val="22"/>
+        </w:rPr>
+        <w:t xml:space="preserve">Elevate </w:t>
+      </w:r>
+      <w:r>
+        <w:rPr>
+          <w:szCs w:val="22"/>
+        </w:rPr>
+        <w:t xml:space="preserve">8005571.05 (P&amp;WC </w:t>
       </w:r>
       <w:r>
         <w:rPr>
@@ -5086,7 +5092,38 @@
         <w:rPr>
           <w:szCs w:val="22"/>
         </w:rPr>
-        <w:t>) Oil Level Sensor</w:t>
+        <w:t>)</w:t>
+      </w:r>
+      <w:r>
+        <w:rPr>
+          <w:szCs w:val="22"/>
+        </w:rPr>
+        <w:t xml:space="preserve"> and 8005572.05 (P&amp;WC </w:t>
+      </w:r>
+      <w:r>
+        <w:rPr>
+          <w:color w:val="000000" w:themeColor="text1"/>
+          <w:szCs w:val="22"/>
+        </w:rPr>
+        <w:t>30Y0241-02</w:t>
+      </w:r>
+      <w:r>
+        <w:rPr>
+          <w:szCs w:val="22"/>
+        </w:rPr>
+        <w:t>)</w:t>
+      </w:r>
+      <w:r>
+        <w:rPr>
+          <w:szCs w:val="22"/>
+        </w:rPr>
+        <w:t xml:space="preserve"> Oil Level Sensor</w:t>
+      </w:r>
+      <w:r>
+        <w:rPr>
+          <w:szCs w:val="22"/>
+        </w:rPr>
+        <w:t>s</w:t>
       </w:r>
       <w:r>
         <w:rPr>
@@ -5467,13 +5504,8 @@
         <w:pStyle w:val="ZL1Section"/>
       </w:pPr>
       <w:bookmarkStart w:id="31" w:name="_Toc238626474"/>
-      <w:proofErr w:type="spellStart"/>
-      <w:r>
-        <w:t>Multi Level</w:t>
-      </w:r>
-      <w:proofErr w:type="spellEnd"/>
-      <w:r>
-        <w:t xml:space="preserve"> Oil Indicator (MLOI) System Overview</w:t>
+      <w:r>
+        <w:t>Multi Level Oil Indicator (MLOI) System Overview</w:t>
       </w:r>
       <w:bookmarkEnd w:id="31"/>
     </w:p>
@@ -5744,12 +5776,60 @@
     </w:p>
     <w:p>
       <w:r>
-        <w:t>The ALLEN 8005571.05 Oil Level sensor  document sets forth the requirements of the Multi-Level Oil Indicator (MLOI) program for automating the acceptance testing of oil level sensors.  The MLOI program is divided into phases or epics.  The first epic is for  automating production tests of Allen 8005571.05 (P&amp;WC 30Y0241-01) Oil Level Sensor In particular the Oil Level Test Bench protocol .</w:t>
-      </w:r>
-    </w:p>
-    <w:p>
-      <w:r>
-        <w:t xml:space="preserve">The OIL level sensor produces a discrete resistance value for two channels, A &amp; B proportional to a range of Levels specified. </w:t>
+        <w:t xml:space="preserve">The ALLEN </w:t>
+      </w:r>
+      <w:r>
+        <w:t xml:space="preserve">Elevate </w:t>
+      </w:r>
+      <w:r>
+        <w:t xml:space="preserve">8005571.05 </w:t>
+      </w:r>
+      <w:r>
+        <w:t xml:space="preserve">and 8005572.05 </w:t>
+      </w:r>
+      <w:r>
+        <w:t xml:space="preserve">Oil Level </w:t>
+      </w:r>
+      <w:r>
+        <w:t>S</w:t>
+      </w:r>
+      <w:r>
+        <w:t>ensor</w:t>
+      </w:r>
+      <w:r>
+        <w:t>s</w:t>
+      </w:r>
+      <w:r>
+        <w:t xml:space="preserve">  document sets forth the requirements of the Multi-Level Oil Indicator (MLOI) program for automating the acceptance testing of oil level sensors.  The MLOI program is divided into phases or epics.  The first epic is for  automating production tests of Allen </w:t>
+      </w:r>
+      <w:r>
+        <w:t>Elevate</w:t>
+      </w:r>
+      <w:r>
+        <w:t xml:space="preserve"> Oil Level Sensor In particular the Oil Level Test Bench protocol .</w:t>
+      </w:r>
+    </w:p>
+    <w:p>
+      <w:r>
+        <w:t>The O</w:t>
+      </w:r>
+      <w:r>
+        <w:t>il</w:t>
+      </w:r>
+      <w:r>
+        <w:t xml:space="preserve"> </w:t>
+      </w:r>
+      <w:r>
+        <w:t>L</w:t>
+      </w:r>
+      <w:r>
+        <w:t xml:space="preserve">evel </w:t>
+      </w:r>
+      <w:r>
+        <w:t>S</w:t>
+      </w:r>
+      <w:r>
+        <w:t xml:space="preserve">ensor produces a discrete resistance value for two channels, A &amp; B proportional to a range of Levels specified. </w:t>
       </w:r>
     </w:p>
     <w:p>
@@ -5759,7 +5839,16 @@
     </w:p>
     <w:p>
       <w:r>
-        <w:t>The ATP specifies two zones based on the oil level range:</w:t>
+        <w:t>The ATP specifies two zones based on the oil level rang</w:t>
+      </w:r>
+      <w:r>
+        <w:t>e</w:t>
+      </w:r>
+      <w:r>
+        <w:t xml:space="preserve"> (See Figure 1)</w:t>
+      </w:r>
+      <w:r>
+        <w:t>:</w:t>
       </w:r>
     </w:p>
     <w:p>
@@ -5797,23 +5886,7 @@
         <w:t xml:space="preserve">Switch Zone   </w:t>
       </w:r>
       <w:r>
-        <w:t xml:space="preserve">-- between measurement zones where the resistance changed from one </w:t>
-      </w:r>
-      <w:proofErr w:type="gramStart"/>
-      <w:r>
-        <w:t>values</w:t>
-      </w:r>
-      <w:proofErr w:type="gramEnd"/>
-      <w:r>
-        <w:t xml:space="preserve"> to the next.  The Resistance switching value transition, (</w:t>
-      </w:r>
-      <w:proofErr w:type="spellStart"/>
-      <w:r>
-        <w:t>ie</w:t>
-      </w:r>
-      <w:proofErr w:type="spellEnd"/>
-      <w:r>
-        <w:t xml:space="preserve"> the Switch Point)  occur before the Oil Level exceeds the specified switch zone exit level limit. </w:t>
+        <w:t xml:space="preserve">-- between measurement zones where the resistance changed from one values to the next.  The Resistance switching value transition, (ie the Switch Point)  occur before the Oil Level exceeds the specified switch zone exit level limit. </w:t>
       </w:r>
     </w:p>
     <w:p>
@@ -5860,7 +5933,31 @@
         </w:numPr>
       </w:pPr>
       <w:r>
-        <w:t>Resistance is not within tolerance at each of 42 Target Test Points after a minimum of .3 second settling time as prescribed in  section 5.6 of ATP for 8005571.05 Oil Level sensor.</w:t>
+        <w:t>Resistance is not within tolerance at each of 42 Target Test Points after a minimum of .3 second settling time as prescribed in  section 5.6 of ATP</w:t>
+      </w:r>
+      <w:r>
+        <w:t>’s</w:t>
+      </w:r>
+      <w:r>
+        <w:t xml:space="preserve"> for </w:t>
+      </w:r>
+      <w:r>
+        <w:t>Elevate</w:t>
+      </w:r>
+      <w:r>
+        <w:t xml:space="preserve"> Oil Level </w:t>
+      </w:r>
+      <w:r>
+        <w:t>S</w:t>
+      </w:r>
+      <w:r>
+        <w:t>ensor</w:t>
+      </w:r>
+      <w:r>
+        <w:t>s</w:t>
+      </w:r>
+      <w:r>
+        <w:t>.</w:t>
       </w:r>
     </w:p>
     <w:p>
@@ -5878,6 +5975,7 @@
     <w:p/>
     <w:p>
       <w:pPr>
+        <w:keepNext/>
         <w:jc w:val="center"/>
       </w:pPr>
       <w:r>
@@ -5942,8 +6040,29 @@
     </w:p>
     <w:p>
       <w:pPr>
-        <w:pStyle w:val="Caption"/>
-      </w:pPr>
+        <w:pStyle w:val="AllenFigures"/>
+      </w:pPr>
+      <w:r>
+        <w:t xml:space="preserve">Figure </w:t>
+      </w:r>
+      <w:r>
+        <w:fldChar w:fldCharType="begin"/>
+      </w:r>
+      <w:r>
+        <w:instrText xml:space="preserve"> SEQ Figure \* ARABIC </w:instrText>
+      </w:r>
+      <w:r>
+        <w:fldChar w:fldCharType="separate"/>
+      </w:r>
+      <w:r>
+        <w:t>1</w:t>
+      </w:r>
+      <w:r>
+        <w:fldChar w:fldCharType="end"/>
+      </w:r>
+      <w:r>
+        <w:t xml:space="preserve">. </w:t>
+      </w:r>
       <w:r>
         <w:t>MLOI System Test Protocol</w:t>
       </w:r>
@@ -6021,11 +6140,9 @@
       <w:r>
         <w:t xml:space="preserve"> have been designed and fit for purpose implemented, </w:t>
       </w:r>
-      <w:proofErr w:type="spellStart"/>
-      <w:r>
-        <w:t>ie</w:t>
-      </w:r>
-      <w:proofErr w:type="spellEnd"/>
+      <w:r>
+        <w:t>i.e.</w:t>
+      </w:r>
       <w:r>
         <w:t xml:space="preserve"> interface unit manufactured as a custom PCB.</w:t>
       </w:r>
@@ -6048,7 +6165,19 @@
         <w:t>The hardware consists of a tank</w:t>
       </w:r>
       <w:r>
-        <w:t>, the Instrumentation, and an Interface Unit as shown in figure 1. The PC workstation and USB hub are out of scope in this specification.</w:t>
+        <w:t xml:space="preserve">, the Instrumentation, and an Interface Unit as shown in </w:t>
+      </w:r>
+      <w:r>
+        <w:t>F</w:t>
+      </w:r>
+      <w:r>
+        <w:t xml:space="preserve">igure </w:t>
+      </w:r>
+      <w:r>
+        <w:t>2</w:t>
+      </w:r>
+      <w:r>
+        <w:t>. The PC workstation and USB hub are out of scope in this specification.</w:t>
       </w:r>
     </w:p>
     <w:p>
@@ -6065,7 +6194,6 @@
         <w:rPr>
           <w:noProof/>
         </w:rPr>
-        <w:lastRenderedPageBreak/>
         <w:drawing>
           <wp:inline distT="0" distB="0" distL="0" distR="0" wp14:anchorId="38CCCE56" wp14:editId="324754DD">
             <wp:extent cx="5207000" cy="3054662"/>
@@ -6115,10 +6243,47 @@
     </w:p>
     <w:p>
       <w:pPr>
-        <w:pStyle w:val="ZCaption"/>
-      </w:pPr>
-      <w:r>
-        <w:t>Figure 1.  Hardware Architecture, functional diagram.</w:t>
+        <w:pStyle w:val="Caption"/>
+        <w:rPr>
+          <w:b/>
+          <w:bCs w:val="0"/>
+          <w:szCs w:val="24"/>
+        </w:rPr>
+      </w:pPr>
+    </w:p>
+    <w:p>
+      <w:pPr>
+        <w:pStyle w:val="AllenFigures"/>
+      </w:pPr>
+      <w:r>
+        <w:rPr>
+          <w:smallCaps w:val="0"/>
+        </w:rPr>
+        <w:t>Figure</w:t>
+      </w:r>
+      <w:r>
+        <w:t xml:space="preserve"> </w:t>
+      </w:r>
+      <w:r>
+        <w:fldChar w:fldCharType="begin"/>
+      </w:r>
+      <w:r>
+        <w:instrText xml:space="preserve"> SEQ Figure \* ARABIC </w:instrText>
+      </w:r>
+      <w:r>
+        <w:fldChar w:fldCharType="separate"/>
+      </w:r>
+      <w:r>
+        <w:t>2</w:t>
+      </w:r>
+      <w:r>
+        <w:fldChar w:fldCharType="end"/>
+      </w:r>
+      <w:r>
+        <w:t xml:space="preserve">. </w:t>
+      </w:r>
+      <w:r>
+        <w:t>Hardware Architecture, functional diagram</w:t>
       </w:r>
     </w:p>
     <w:p>
@@ -6169,7 +6334,16 @@
         <w:t xml:space="preserve">is the chamber </w:t>
       </w:r>
       <w:r>
-        <w:t>containing the bulk of the oil &lt;spec/description??&gt;</w:t>
+        <w:t xml:space="preserve">containing the bulk of the </w:t>
+      </w:r>
+      <w:r>
+        <w:t xml:space="preserve">turbine engine </w:t>
+      </w:r>
+      <w:r>
+        <w:t xml:space="preserve">oil </w:t>
+      </w:r>
+      <w:r>
+        <w:t>conforming to MIL-PRF-23699 or MIL-PRF-7808.</w:t>
       </w:r>
     </w:p>
     <w:p>
@@ -6196,7 +6370,19 @@
         </w:numPr>
       </w:pPr>
       <w:r>
-        <w:t>Senor Rack Plate holds the sensors in place during measurements</w:t>
+        <w:t>Sen</w:t>
+      </w:r>
+      <w:r>
+        <w:t>s</w:t>
+      </w:r>
+      <w:r>
+        <w:t xml:space="preserve">or Rack </w:t>
+      </w:r>
+      <w:r>
+        <w:t xml:space="preserve">Mounting </w:t>
+      </w:r>
+      <w:r>
+        <w:t>Plate holds the sensors in place during measurements</w:t>
       </w:r>
       <w:r>
         <w:t xml:space="preserve"> and provides the sensor</w:t>
@@ -6205,13 +6391,8 @@
         <w:t xml:space="preserve"> reference</w:t>
       </w:r>
       <w:r>
-        <w:t xml:space="preserve"> level </w:t>
-      </w:r>
-      <w:proofErr w:type="gramStart"/>
-      <w:r>
-        <w:t>datum</w:t>
-      </w:r>
-      <w:proofErr w:type="gramEnd"/>
+        <w:t xml:space="preserve"> level datum</w:t>
+      </w:r>
       <w:r>
         <w:t>.</w:t>
       </w:r>
@@ -6290,116 +6471,104 @@
         <w:rPr>
           <w:rFonts w:eastAsiaTheme="minorEastAsia"/>
         </w:rPr>
-        <w:t xml:space="preserve">Using the </w:t>
-      </w:r>
-      <w:proofErr w:type="spellStart"/>
+        <w:t xml:space="preserve">Using the Pololu MC18V7 PWM motor controller with Vs set to 24Vdc,  The </w:t>
+      </w:r>
       <w:r>
         <w:rPr>
           <w:rFonts w:eastAsiaTheme="minorEastAsia"/>
         </w:rPr>
-        <w:t>Pololu</w:t>
-      </w:r>
-      <w:proofErr w:type="spellEnd"/>
+        <w:sym w:font="Symbol" w:char="F044"/>
+      </w:r>
       <w:r>
         <w:rPr>
           <w:rFonts w:eastAsiaTheme="minorEastAsia"/>
         </w:rPr>
-        <w:t xml:space="preserve"> MC18V7 PWM motor controller with Vs set to 24Vdc,  The </w:t>
+        <w:t xml:space="preserve"> Level was measure</w:t>
       </w:r>
       <w:r>
         <w:rPr>
           <w:rFonts w:eastAsiaTheme="minorEastAsia"/>
         </w:rPr>
-        <w:sym w:font="Symbol" w:char="F044"/>
+        <w:t>d</w:t>
       </w:r>
       <w:r>
         <w:rPr>
           <w:rFonts w:eastAsiaTheme="minorEastAsia"/>
         </w:rPr>
-        <w:t xml:space="preserve"> Level was measure</w:t>
-      </w:r>
+        <w:t xml:space="preserve"> for 30 seconds at various percent of max speed (100% duty cycle) for both FILL and DRAIN at near EMPTY and near FULL.</w:t>
+      </w:r>
+    </w:p>
+    <w:p>
+      <w:pPr>
+        <w:pStyle w:val="ZPara"/>
+      </w:pPr>
       <w:r>
         <w:rPr>
           <w:rFonts w:eastAsiaTheme="minorEastAsia"/>
         </w:rPr>
-        <w:t>d</w:t>
+        <w:lastRenderedPageBreak/>
+        <w:t>The response has a minor shift at each case but is basically linear down to about 5% resulting in fill rate of about 0.1”/min where the control becomes unstable by 4% as shown in the ‘Zoomed In Pl</w:t>
       </w:r>
       <w:r>
         <w:rPr>
           <w:rFonts w:eastAsiaTheme="minorEastAsia"/>
         </w:rPr>
-        <w:t xml:space="preserve"> for 30 seconds at various percent of max speed (100% duty cycle) for both FILL and DRAIN at near EMPTY and near FULL.</w:t>
+        <w:t>ot</w:t>
+      </w:r>
+      <w:r>
+        <w:rPr>
+          <w:rFonts w:eastAsiaTheme="minorEastAsia"/>
+        </w:rPr>
+        <w:t xml:space="preserve"> in Figure 3</w:t>
+      </w:r>
+      <w:r>
+        <w:rPr>
+          <w:rFonts w:eastAsiaTheme="minorEastAsia"/>
+        </w:rPr>
+        <w:t>.</w:t>
       </w:r>
     </w:p>
     <w:p>
       <w:pPr>
         <w:pStyle w:val="ZPara"/>
-      </w:pPr>
-      <w:r>
         <w:rPr>
           <w:rFonts w:eastAsiaTheme="minorEastAsia"/>
         </w:rPr>
-        <w:t>The response has a minor shift at each case but is basically linear down to about 5% resulting in fill rate of about 0.1”/min where the control becomes unstable by 4% as shown in the ‘Zoomed In Plot.</w:t>
+      </w:pPr>
+      <w:r>
+        <w:rPr>
+          <w:rFonts w:eastAsiaTheme="minorEastAsia"/>
+        </w:rPr>
+        <w:t xml:space="preserve">Without doing an extensive fluid analysis, this response is assumed to be adequate for the MLOI application. </w:t>
+      </w:r>
+      <w:r>
+        <w:rPr>
+          <w:rFonts w:eastAsiaTheme="minorEastAsia"/>
+          <w:color w:val="EE0000"/>
+        </w:rPr>
+        <w:t>Data from mloi:\PM_Folder\_3 Develop\Design Calculations.xlsx sheet Tank.  3/4/2025 R. Ales</w:t>
+      </w:r>
+      <w:r>
+        <w:rPr>
+          <w:rFonts w:eastAsiaTheme="minorEastAsia"/>
+          <w:color w:val="EE0000"/>
+        </w:rPr>
+        <w:t xml:space="preserve"> ??</w:t>
       </w:r>
     </w:p>
     <w:p>
       <w:pPr>
         <w:pStyle w:val="ZPara"/>
       </w:pPr>
-      <w:r>
-        <w:rPr>
-          <w:rFonts w:eastAsiaTheme="minorEastAsia"/>
-        </w:rPr>
-        <w:t xml:space="preserve">Without doing an extensive fluid analysis, this response is assumed to be adequate </w:t>
-      </w:r>
-      <w:r>
-        <w:rPr>
-          <w:rFonts w:eastAsiaTheme="minorEastAsia"/>
-        </w:rPr>
-        <w:lastRenderedPageBreak/>
-        <w:t xml:space="preserve">for the MLOI application. Data from </w:t>
-      </w:r>
-      <w:proofErr w:type="spellStart"/>
-      <w:r>
-        <w:rPr>
-          <w:rFonts w:eastAsiaTheme="minorEastAsia"/>
-        </w:rPr>
-        <w:t>mloi</w:t>
-      </w:r>
-      <w:proofErr w:type="spellEnd"/>
-      <w:r>
-        <w:rPr>
-          <w:rFonts w:eastAsiaTheme="minorEastAsia"/>
-        </w:rPr>
-        <w:t>:\</w:t>
-      </w:r>
-      <w:proofErr w:type="spellStart"/>
-      <w:r>
-        <w:rPr>
-          <w:rFonts w:eastAsiaTheme="minorEastAsia"/>
-        </w:rPr>
-        <w:t>PM_Folder</w:t>
-      </w:r>
-      <w:proofErr w:type="spellEnd"/>
-      <w:r>
-        <w:rPr>
-          <w:rFonts w:eastAsiaTheme="minorEastAsia"/>
-        </w:rPr>
-        <w:t>\_3 Develop\Design Calculations.xlsx sheet Tank.  3/4/2025 R. Ales</w:t>
-      </w:r>
-    </w:p>
-    <w:p>
-      <w:pPr>
-        <w:pStyle w:val="ZPara"/>
-        <w:ind w:left="864"/>
-        <w:jc w:val="left"/>
-      </w:pPr>
-      <w:r>
-        <w:rPr>
-          <w:noProof/>
-        </w:rPr>
+    </w:p>
+    <w:p>
+      <w:pPr>
+        <w:pStyle w:val="AllenFigures"/>
+        <w:keepNext/>
+      </w:pPr>
+      <w:r>
         <w:drawing>
-          <wp:inline distT="0" distB="0" distL="0" distR="0" wp14:anchorId="10CC06CD" wp14:editId="4DE7F2E9">
+          <wp:inline distT="0" distB="0" distL="0" distR="0" wp14:anchorId="10CC06CD" wp14:editId="6BF487C6">
             <wp:extent cx="5086350" cy="1526818"/>
             <wp:effectExtent l="0" t="0" r="0" b="0"/>
             <wp:docPr id="811178072" name="Picture 1"/>
@@ -6447,10 +6616,37 @@
     </w:p>
     <w:p>
       <w:pPr>
-        <w:pStyle w:val="ZCaption"/>
-      </w:pPr>
-      <w:r>
-        <w:t>Figure 2.  Tank / Pump level response.</w:t>
+        <w:pStyle w:val="AllenFigures"/>
+      </w:pPr>
+      <w:r>
+        <w:rPr>
+          <w:smallCaps w:val="0"/>
+        </w:rPr>
+        <w:t>Figure</w:t>
+      </w:r>
+      <w:r>
+        <w:t xml:space="preserve"> </w:t>
+      </w:r>
+      <w:r>
+        <w:fldChar w:fldCharType="begin"/>
+      </w:r>
+      <w:r>
+        <w:instrText xml:space="preserve"> SEQ Figure \* ARABIC </w:instrText>
+      </w:r>
+      <w:r>
+        <w:fldChar w:fldCharType="separate"/>
+      </w:r>
+      <w:r>
+        <w:t>3</w:t>
+      </w:r>
+      <w:r>
+        <w:fldChar w:fldCharType="end"/>
+      </w:r>
+      <w:r>
+        <w:t xml:space="preserve">. </w:t>
+      </w:r>
+      <w:r>
+        <w:t>Tank / Pump level response.</w:t>
       </w:r>
     </w:p>
     <w:p>
@@ -6487,37 +6683,53 @@
         </w:rPr>
         <w:t xml:space="preserve">As currently designed, the Pump is controlled by a 3-speed servo controller implemented in LV.  The Pump is driven at FAST, SLOW and Creep speeds over the corresponding speed ranges based on the error (Set Point minus Process Variable, e = SP – PV)  Thes “pump parameter” are </w:t>
       </w:r>
-      <w:proofErr w:type="spellStart"/>
       <w:r>
         <w:rPr>
           <w:rFonts w:eastAsiaTheme="minorEastAsia"/>
         </w:rPr>
-        <w:t>setable</w:t>
-      </w:r>
-      <w:proofErr w:type="spellEnd"/>
+        <w:t>settable</w:t>
+      </w:r>
       <w:r>
         <w:rPr>
           <w:rFonts w:eastAsiaTheme="minorEastAsia"/>
         </w:rPr>
         <w:t xml:space="preserve"> in the $</w:t>
       </w:r>
-      <w:proofErr w:type="spellStart"/>
       <w:r>
         <w:rPr>
           <w:rFonts w:eastAsiaTheme="minorEastAsia"/>
         </w:rPr>
-        <w:t>Configuaation</w:t>
-      </w:r>
-      <w:proofErr w:type="spellEnd"/>
+        <w:t>Configuration</w:t>
+      </w:r>
       <w:r>
         <w:rPr>
           <w:rFonts w:eastAsiaTheme="minorEastAsia"/>
         </w:rPr>
-        <w:t xml:space="preserve"> File where speed is specified in terms of percent of maximum Pump flow rate of 100%.  Figure 3 shows the level step at 600</w:t>
+        <w:t xml:space="preserve"> File where speed is specified in terms of percent of maximum Pump flow rate of 100%.  </w:t>
       </w:r>
       <w:r>
         <w:rPr>
           <w:rFonts w:eastAsiaTheme="minorEastAsia"/>
+          <w:highlight w:val="yellow"/>
+        </w:rPr>
+        <w:t xml:space="preserve">Figure </w:t>
+      </w:r>
+      <w:r>
+        <w:rPr>
+          <w:rFonts w:eastAsiaTheme="minorEastAsia"/>
+          <w:highlight w:val="yellow"/>
+        </w:rPr>
+        <w:t>4</w:t>
+      </w:r>
+      <w:r>
+        <w:rPr>
+          <w:rFonts w:eastAsiaTheme="minorEastAsia"/>
+        </w:rPr>
+        <w:t xml:space="preserve"> shows the level step at 600</w:t>
+      </w:r>
+      <w:r>
+        <w:rPr>
+          <w:rFonts w:eastAsiaTheme="minorEastAsia"/>
         </w:rPr>
         <w:sym w:font="Symbol" w:char="F057"/>
       </w:r>
@@ -6539,19 +6751,18 @@
         </w:rPr>
         <w:t xml:space="preserve">.  </w:t>
       </w:r>
-      <w:proofErr w:type="gramStart"/>
       <w:r>
         <w:rPr>
           <w:rFonts w:eastAsiaTheme="minorEastAsia"/>
-        </w:rPr>
-        <w:t>Figure 4,</w:t>
-      </w:r>
-      <w:proofErr w:type="gramEnd"/>
+          <w:highlight w:val="yellow"/>
+        </w:rPr>
+        <w:t>Figure 4</w:t>
+      </w:r>
       <w:r>
         <w:rPr>
           <w:rFonts w:eastAsiaTheme="minorEastAsia"/>
         </w:rPr>
-        <w:t xml:space="preserve"> shows the level zoomed-in to the 0.001” per tick, over the 3-second pause for measurement.  </w:t>
+        <w:t xml:space="preserve">, shows the level zoomed-in to the 0.001” per tick, over the 3-second pause for measurement.  </w:t>
       </w:r>
     </w:p>
     <w:p>
@@ -6567,12 +6778,60 @@
     <w:p>
       <w:pPr>
         <w:pStyle w:val="ZPara"/>
+        <w:keepNext/>
         <w:ind w:left="864"/>
-        <w:jc w:val="left"/>
+        <w:jc w:val="center"/>
         <w:rPr>
           <w:rFonts w:eastAsiaTheme="minorEastAsia"/>
-        </w:rPr>
-      </w:pPr>
+          <w:i/>
+          <w:iCs/>
+          <w:color w:val="EE0000"/>
+        </w:rPr>
+      </w:pPr>
+      <w:r>
+        <w:rPr>
+          <w:rFonts w:eastAsiaTheme="minorEastAsia"/>
+          <w:i/>
+          <w:iCs/>
+          <w:color w:val="EE0000"/>
+        </w:rPr>
+        <w:t>Add Figure 4</w:t>
+      </w:r>
+    </w:p>
+    <w:p>
+      <w:pPr>
+        <w:pStyle w:val="AllenFigures"/>
+        <w:rPr>
+          <w:rFonts w:eastAsiaTheme="minorEastAsia"/>
+        </w:rPr>
+      </w:pPr>
+      <w:r>
+        <w:rPr>
+          <w:smallCaps w:val="0"/>
+        </w:rPr>
+        <w:t>Figure</w:t>
+      </w:r>
+      <w:r>
+        <w:t xml:space="preserve"> </w:t>
+      </w:r>
+      <w:r>
+        <w:fldChar w:fldCharType="begin"/>
+      </w:r>
+      <w:r>
+        <w:instrText xml:space="preserve"> SEQ Figure \* ARABIC </w:instrText>
+      </w:r>
+      <w:r>
+        <w:fldChar w:fldCharType="separate"/>
+      </w:r>
+      <w:r>
+        <w:t>4</w:t>
+      </w:r>
+      <w:r>
+        <w:fldChar w:fldCharType="end"/>
+      </w:r>
+      <w:r>
+        <w:t xml:space="preserve">. </w:t>
+      </w:r>
     </w:p>
     <w:p>
       <w:pPr>
@@ -6601,23 +6860,7 @@
         <w:t xml:space="preserve">) and two resistance measurements </w:t>
       </w:r>
       <w:r>
-        <w:t>for each sensor DUT (DataQ DI2108) and provides directional DC motor control (</w:t>
-      </w:r>
-      <w:proofErr w:type="spellStart"/>
-      <w:r>
-        <w:t>Pololu</w:t>
-      </w:r>
-      <w:proofErr w:type="spellEnd"/>
-      <w:r>
-        <w:t xml:space="preserve"> MC18V7) via </w:t>
-      </w:r>
-      <w:proofErr w:type="spellStart"/>
-      <w:r>
-        <w:t>Univeral</w:t>
-      </w:r>
-      <w:proofErr w:type="spellEnd"/>
-      <w:r>
-        <w:t xml:space="preserve"> Serial Bus (USB).</w:t>
+        <w:t>for each sensor DUT (DataQ DI2108) and provides directional DC motor control (Pololu MC18V7) via Univeral Serial Bus (USB).</w:t>
       </w:r>
     </w:p>
     <w:p>
@@ -6627,9 +6870,21 @@
     </w:p>
     <w:p>
       <w:pPr>
+        <w:spacing w:after="0"/>
+        <w:rPr>
+          <w:u w:val="single"/>
+        </w:rPr>
+      </w:pPr>
+      <w:r>
+        <w:br w:type="page"/>
+      </w:r>
+    </w:p>
+    <w:p>
+      <w:pPr>
         <w:pStyle w:val="STYLE7"/>
       </w:pPr>
       <w:r>
+        <w:lastRenderedPageBreak/>
         <w:t xml:space="preserve">Level Measurement - Keyance Laser </w:t>
       </w:r>
       <w:r>
@@ -6641,7 +6896,10 @@
         <w:pStyle w:val="ZPara"/>
       </w:pPr>
       <w:r>
-        <w:t xml:space="preserve">Is a spot beam, displacement measurement laser, tune for +500mm (19.6”).  </w:t>
+        <w:t>The Keyance Laser LK-G500 is a</w:t>
+      </w:r>
+      <w:r>
+        <w:t xml:space="preserve"> spot beam, displacement measurement laser, tune for +500mm (19.6”).  </w:t>
       </w:r>
     </w:p>
     <w:p>
@@ -6749,34 +7007,19 @@
     <w:p>
       <w:pPr>
         <w:pStyle w:val="ZPara"/>
-      </w:pPr>
-    </w:p>
-    <w:p>
-      <w:pPr>
-        <w:spacing w:after="0"/>
+        <w:spacing w:before="60"/>
+        <w:ind w:left="1440"/>
         <w:rPr>
           <w:u w:val="single"/>
         </w:rPr>
       </w:pPr>
-      <w:r>
-        <w:br w:type="page"/>
-      </w:r>
     </w:p>
     <w:p>
       <w:pPr>
         <w:pStyle w:val="STYLE7"/>
       </w:pPr>
       <w:r>
-        <w:lastRenderedPageBreak/>
-        <w:t>Resistance Measurement -</w:t>
-      </w:r>
-      <w:proofErr w:type="spellStart"/>
-      <w:r>
-        <w:t>DataQ</w:t>
-      </w:r>
-      <w:proofErr w:type="spellEnd"/>
-      <w:r>
-        <w:t xml:space="preserve"> DI2108</w:t>
+        <w:t>Resistance Measurement -DataQ DI2108</w:t>
       </w:r>
     </w:p>
     <w:p>
@@ -7253,21 +7496,7 @@
         <w:rPr>
           <w:sz w:val="20"/>
         </w:rPr>
-        <w:t>100 ppm (</w:t>
-      </w:r>
-      <w:proofErr w:type="gramStart"/>
-      <w:r>
-        <w:rPr>
-          <w:sz w:val="20"/>
-        </w:rPr>
-        <w:t>typical</w:t>
-      </w:r>
-      <w:proofErr w:type="gramEnd"/>
-      <w:r>
-        <w:rPr>
-          <w:sz w:val="20"/>
-        </w:rPr>
-        <w:t xml:space="preserve"> over 24 hours)</w:t>
+        <w:t>100 ppm (typical over 24 hours)</w:t>
       </w:r>
     </w:p>
     <w:p>
@@ -7652,18 +7881,22 @@
     </w:p>
     <w:p>
       <w:pPr>
+        <w:spacing w:after="0"/>
+        <w:rPr>
+          <w:u w:val="single"/>
+        </w:rPr>
+      </w:pPr>
+      <w:r>
+        <w:br w:type="page"/>
+      </w:r>
+    </w:p>
+    <w:p>
+      <w:pPr>
         <w:pStyle w:val="STYLE7"/>
       </w:pPr>
       <w:r>
-        <w:t xml:space="preserve">Motor Controller - </w:t>
-      </w:r>
-      <w:proofErr w:type="spellStart"/>
-      <w:r>
-        <w:t>Pololu</w:t>
-      </w:r>
-      <w:proofErr w:type="spellEnd"/>
-      <w:r>
-        <w:t xml:space="preserve"> MC18V7</w:t>
+        <w:lastRenderedPageBreak/>
+        <w:t>Motor Controller - Pololu MC18V7</w:t>
       </w:r>
     </w:p>
     <w:p>
@@ -7675,15 +7908,7 @@
         <w:t xml:space="preserve">A </w:t>
       </w:r>
       <w:r>
-        <w:t xml:space="preserve">general purpose motor controllers for </w:t>
-      </w:r>
-      <w:proofErr w:type="gramStart"/>
-      <w:r>
-        <w:t>brushed,</w:t>
-      </w:r>
-      <w:proofErr w:type="gramEnd"/>
-      <w:r>
-        <w:t xml:space="preserve"> DC motors</w:t>
+        <w:t>general purpose motor controllers for brushed, DC motors</w:t>
       </w:r>
       <w:r>
         <w:t xml:space="preserve"> with USB connectivity.</w:t>
@@ -7754,45 +7979,21 @@
           <w:szCs w:val="20"/>
         </w:rPr>
       </w:pPr>
-      <w:r>
-        <w:rPr>
-          <w:sz w:val="20"/>
-          <w:szCs w:val="20"/>
-        </w:rPr>
-        <w:t>”</w:t>
-      </w:r>
+    </w:p>
+    <w:p>
+      <w:pPr>
+        <w:pStyle w:val="ZL3Section"/>
+      </w:pPr>
+      <w:bookmarkStart w:id="38" w:name="_Toc238626480"/>
+      <w:r>
+        <w:t>Interface Unit</w:t>
+      </w:r>
+      <w:bookmarkEnd w:id="38"/>
     </w:p>
     <w:p>
       <w:pPr>
         <w:pStyle w:val="ZPara"/>
       </w:pPr>
-    </w:p>
-    <w:p>
-      <w:pPr>
-        <w:spacing w:after="0"/>
-        <w:rPr>
-          <w:u w:val="single"/>
-        </w:rPr>
-      </w:pPr>
-      <w:bookmarkStart w:id="38" w:name="_Toc238626480"/>
-      <w:r>
-        <w:br w:type="page"/>
-      </w:r>
-    </w:p>
-    <w:p>
-      <w:pPr>
-        <w:pStyle w:val="ZL3Section"/>
-      </w:pPr>
-      <w:r>
-        <w:lastRenderedPageBreak/>
-        <w:t>Interface Unit</w:t>
-      </w:r>
-      <w:bookmarkEnd w:id="38"/>
-    </w:p>
-    <w:p>
-      <w:pPr>
-        <w:pStyle w:val="ZPara"/>
-      </w:pPr>
       <w:r>
         <w:t xml:space="preserve">The interface unit provides </w:t>
       </w:r>
@@ -7836,11 +8037,7 @@
         <w:t xml:space="preserve"> </w:t>
       </w:r>
       <w:r>
-        <w:t>so sensor channel resistance (</w:t>
-      </w:r>
-      <w:proofErr w:type="spellStart"/>
-      <w:r>
-        <w:t>R</w:t>
+        <w:t>so sensor channel resistance (R</w:t>
       </w:r>
       <w:r>
         <w:rPr>
@@ -7848,13 +8045,8 @@
         </w:rPr>
         <w:t>chx</w:t>
       </w:r>
-      <w:proofErr w:type="spellEnd"/>
-      <w:r>
-        <w:t>) can be calculated from the sensor signal (</w:t>
-      </w:r>
-      <w:proofErr w:type="spellStart"/>
-      <w:r>
-        <w:t>V</w:t>
+      <w:r>
+        <w:t>) can be calculated from the sensor signal (V</w:t>
       </w:r>
       <w:r>
         <w:rPr>
@@ -7862,7 +8054,6 @@
         </w:rPr>
         <w:t>m</w:t>
       </w:r>
-      <w:proofErr w:type="spellEnd"/>
       <w:r>
         <w:t>):</w:t>
       </w:r>
@@ -7873,71 +8064,56 @@
         <w:ind w:firstLine="360"/>
       </w:pPr>
       <w:r>
+        <w:t xml:space="preserve"> R</w:t>
+      </w:r>
+      <w:r>
+        <w:rPr>
+          <w:vertAlign w:val="subscript"/>
+        </w:rPr>
+        <w:t>chx</w:t>
+      </w:r>
+      <w:r>
+        <w:t xml:space="preserve"> = V</w:t>
+      </w:r>
+      <w:r>
+        <w:rPr>
+          <w:vertAlign w:val="subscript"/>
+        </w:rPr>
+        <w:t>m</w:t>
+      </w:r>
+      <w:r>
+        <w:t xml:space="preserve">  </w:t>
+      </w:r>
+      <w:r>
+        <w:t>/ I</w:t>
+      </w:r>
+      <w:r>
+        <w:rPr>
+          <w:vertAlign w:val="subscript"/>
+        </w:rPr>
+        <w:t>s</w:t>
+      </w:r>
+      <w:r>
+        <w:rPr>
+          <w:vertAlign w:val="subscript"/>
+        </w:rPr>
+        <w:t xml:space="preserve">     </w:t>
+      </w:r>
+      <w:r>
+        <w:t>where V</w:t>
+      </w:r>
+      <w:r>
+        <w:rPr>
+          <w:vertAlign w:val="subscript"/>
+        </w:rPr>
+        <w:t>m</w:t>
+      </w:r>
+      <w:r>
+        <w:rPr>
+          <w:vertAlign w:val="subscript"/>
+        </w:rPr>
         <w:t xml:space="preserve"> </w:t>
       </w:r>
-      <w:proofErr w:type="spellStart"/>
-      <w:r>
-        <w:t>R</w:t>
-      </w:r>
-      <w:r>
-        <w:rPr>
-          <w:vertAlign w:val="subscript"/>
-        </w:rPr>
-        <w:t>chx</w:t>
-      </w:r>
-      <w:proofErr w:type="spellEnd"/>
-      <w:r>
-        <w:t xml:space="preserve"> = </w:t>
-      </w:r>
-      <w:proofErr w:type="spellStart"/>
-      <w:r>
-        <w:t>V</w:t>
-      </w:r>
-      <w:r>
-        <w:rPr>
-          <w:vertAlign w:val="subscript"/>
-        </w:rPr>
-        <w:t>m</w:t>
-      </w:r>
-      <w:proofErr w:type="spellEnd"/>
-      <w:r>
-        <w:t xml:space="preserve">  </w:t>
-      </w:r>
-      <w:r>
-        <w:t>/ I</w:t>
-      </w:r>
-      <w:r>
-        <w:rPr>
-          <w:vertAlign w:val="subscript"/>
-        </w:rPr>
-        <w:t>s</w:t>
-      </w:r>
-      <w:r>
-        <w:rPr>
-          <w:vertAlign w:val="subscript"/>
-        </w:rPr>
-        <w:t xml:space="preserve">     </w:t>
-      </w:r>
-      <w:r>
-        <w:t xml:space="preserve">where </w:t>
-      </w:r>
-      <w:proofErr w:type="spellStart"/>
-      <w:r>
-        <w:t>V</w:t>
-      </w:r>
-      <w:r>
-        <w:rPr>
-          <w:vertAlign w:val="subscript"/>
-        </w:rPr>
-        <w:t>m</w:t>
-      </w:r>
-      <w:proofErr w:type="spellEnd"/>
-      <w:r>
-        <w:rPr>
-          <w:vertAlign w:val="subscript"/>
-        </w:rPr>
-        <w:t xml:space="preserve"> </w:t>
-      </w:r>
       <w:r>
         <w:t>is the measured voltage from the sensor.</w:t>
       </w:r>
@@ -7964,15 +8140,7 @@
         <w:t xml:space="preserve"> provide</w:t>
       </w:r>
       <w:r>
-        <w:t xml:space="preserve">s a place to mount the </w:t>
-      </w:r>
-      <w:proofErr w:type="spellStart"/>
-      <w:r>
-        <w:t>Pololu</w:t>
-      </w:r>
-      <w:proofErr w:type="spellEnd"/>
-      <w:r>
-        <w:t xml:space="preserve"> Motor Controller.  It also provides a</w:t>
+        <w:t>s a place to mount the Pololu Motor Controller.  It also provides a</w:t>
       </w:r>
       <w:r>
         <w:t xml:space="preserve"> means to connect the system components including the Power Supplies,</w:t>
@@ -8135,7 +8303,43 @@
         <w:t xml:space="preserve"> following the </w:t>
       </w:r>
       <w:r>
-        <w:t>LT3092 Datasheet Application Information page 9.  Then 15</w:t>
+        <w:rPr>
+          <w:color w:val="EE0000"/>
+        </w:rPr>
+        <w:t>LT3092 Datasheet Application Information page 9</w:t>
+      </w:r>
+      <w:r>
+        <w:rPr>
+          <w:color w:val="EE0000"/>
+        </w:rPr>
+        <w:t xml:space="preserve">??? </w:t>
+      </w:r>
+      <w:r>
+        <w:rPr>
+          <w:i/>
+          <w:iCs/>
+          <w:color w:val="EE0000"/>
+        </w:rPr>
+        <w:t>(where is this located</w:t>
+      </w:r>
+      <w:r>
+        <w:rPr>
+          <w:i/>
+          <w:iCs/>
+          <w:color w:val="EE0000"/>
+        </w:rPr>
+        <w:t xml:space="preserve"> should add to an Appendix</w:t>
+      </w:r>
+      <w:r>
+        <w:rPr>
+          <w:i/>
+          <w:iCs/>
+          <w:color w:val="EE0000"/>
+        </w:rPr>
+        <w:t>)</w:t>
+      </w:r>
+      <w:r>
+        <w:t>.  Then 15</w:t>
       </w:r>
       <w:r>
         <w:sym w:font="Symbol" w:char="F057"/>
@@ -8171,21 +8375,30 @@
         <w:t xml:space="preserve">SET </w:t>
       </w:r>
       <w:r>
-        <w:t xml:space="preserve">as shown in Figure 2. </w:t>
+        <w:t xml:space="preserve">as shown in Figure </w:t>
+      </w:r>
+      <w:r>
+        <w:t>5</w:t>
+      </w:r>
+      <w:r>
+        <w:t xml:space="preserve">. </w:t>
       </w:r>
     </w:p>
     <w:p>
       <w:pPr>
         <w:pStyle w:val="ZPara"/>
+        <w:keepNext/>
+        <w:jc w:val="center"/>
       </w:pPr>
       <w:r>
         <w:rPr>
           <w:noProof/>
         </w:rPr>
+        <w:lastRenderedPageBreak/>
         <w:drawing>
-          <wp:inline distT="0" distB="0" distL="0" distR="0" wp14:anchorId="47D7C2EC" wp14:editId="27476AB8">
-            <wp:extent cx="2476500" cy="1534695"/>
-            <wp:effectExtent l="0" t="0" r="0" b="8890"/>
+          <wp:inline distT="0" distB="0" distL="0" distR="0" wp14:anchorId="47D7C2EC" wp14:editId="60E986F5">
+            <wp:extent cx="2788780" cy="1728216"/>
+            <wp:effectExtent l="0" t="0" r="0" b="5715"/>
             <wp:docPr id="6" name="Picture 5" descr="A diagram of a circuit&#10;&#10;AI-generated content may be incorrect.">
               <a:extLst xmlns:a="http://schemas.openxmlformats.org/drawingml/2006/main">
                 <a:ext uri="{FF2B5EF4-FFF2-40B4-BE49-F238E27FC236}">
@@ -8220,7 +8433,7 @@
                   <pic:spPr>
                     <a:xfrm>
                       <a:off x="0" y="0"/>
-                      <a:ext cx="2476500" cy="1534695"/>
+                      <a:ext cx="2798621" cy="1734314"/>
                     </a:xfrm>
                     <a:prstGeom prst="rect">
                       <a:avLst/>
@@ -8236,14 +8449,47 @@
     <w:p>
       <w:pPr>
         <w:pStyle w:val="Caption"/>
-      </w:pPr>
-      <w:r>
-        <w:t>Figure 2.  LT3092 Current Source Circuit</w:t>
+        <w:rPr>
+          <w:szCs w:val="24"/>
+        </w:rPr>
+      </w:pPr>
+      <w:r>
+        <w:t xml:space="preserve">Figure </w:t>
+      </w:r>
+      <w:r>
+        <w:fldChar w:fldCharType="begin"/>
+      </w:r>
+      <w:r>
+        <w:instrText xml:space="preserve"> SEQ Figure \* ARABIC </w:instrText>
+      </w:r>
+      <w:r>
+        <w:fldChar w:fldCharType="separate"/>
+      </w:r>
+      <w:r>
+        <w:rPr>
+          <w:noProof/>
+        </w:rPr>
+        <w:t>5</w:t>
+      </w:r>
+      <w:r>
+        <w:fldChar w:fldCharType="end"/>
+      </w:r>
+      <w:r>
+        <w:t xml:space="preserve">. </w:t>
+      </w:r>
+      <w:r>
+        <w:rPr>
+          <w:szCs w:val="24"/>
+        </w:rPr>
+        <w:t>LT3092 Current Source Circuit</w:t>
       </w:r>
     </w:p>
     <w:p>
       <w:pPr>
         <w:pStyle w:val="ZPara"/>
+        <w:rPr>
+          <w:u w:val="single"/>
+        </w:rPr>
       </w:pPr>
       <w:r>
         <w:t xml:space="preserve">   </w:t>
@@ -8251,28 +8497,11 @@
     </w:p>
     <w:p>
       <w:pPr>
-        <w:spacing w:after="0"/>
-        <w:rPr>
-          <w:u w:val="single"/>
-        </w:rPr>
-      </w:pPr>
-      <w:r>
-        <w:br w:type="page"/>
-      </w:r>
-    </w:p>
-    <w:p>
-      <w:pPr>
         <w:pStyle w:val="STYLE7"/>
       </w:pPr>
       <w:r>
-        <w:lastRenderedPageBreak/>
         <w:t>Buffer/Scaler Circuit</w:t>
       </w:r>
-    </w:p>
-    <w:p>
-      <w:pPr>
-        <w:pStyle w:val="ListParagraph"/>
-      </w:pPr>
     </w:p>
     <w:p>
       <w:pPr>
@@ -8309,107 +8538,102 @@
     <w:p>
       <w:pPr>
         <w:pStyle w:val="ListParagraph"/>
-        <w:ind w:left="1440"/>
-      </w:pPr>
+      </w:pPr>
+      <w:r>
+        <w:t>To achieve Rin &gt; 1M</w:t>
+      </w:r>
+      <w:r>
+        <w:sym w:font="Symbol" w:char="F057"/>
+      </w:r>
+      <w:r>
+        <w:t xml:space="preserve">, a LM2902 unity gain, follower circuit will buffer and isolate the DUT from the Analog Input impedance.  </w:t>
+      </w:r>
+      <w:r>
+        <w:t>With maximum signal voltage V</w:t>
+      </w:r>
+      <w:r>
+        <w:rPr>
+          <w:vertAlign w:val="subscript"/>
+        </w:rPr>
+        <w:t>s</w:t>
+      </w:r>
+      <w:r>
+        <w:t xml:space="preserve"> &gt; 16.7V and the maximum input voltage range of the DI-2108 of +/-10.0V, then V</w:t>
+      </w:r>
+      <w:r>
+        <w:rPr>
+          <w:vertAlign w:val="subscript"/>
+        </w:rPr>
+        <w:t>s</w:t>
+      </w:r>
+      <w:r>
+        <w:t xml:space="preserve"> must be scaled to fit within the input range. This accomplished with voltage divider circuit consisting of R</w:t>
+      </w:r>
+      <w:r>
+        <w:t>7 (R9)</w:t>
+      </w:r>
+      <w:r>
+        <w:t xml:space="preserve"> and R</w:t>
+      </w:r>
+      <w:r>
+        <w:t>8 (R10).</w:t>
+      </w:r>
+      <w:r>
+        <w:t xml:space="preserve"> where the parallel resistance (Rin = R</w:t>
+      </w:r>
+      <w:r>
+        <w:t>7</w:t>
+      </w:r>
+      <w:r>
+        <w:t xml:space="preserve"> || R</w:t>
+      </w:r>
+      <w:r>
+        <w:t>9</w:t>
+      </w:r>
+      <w:r>
+        <w:t>) is greater than 1M</w:t>
+      </w:r>
+      <w:r>
+        <w:sym w:font="Symbol" w:char="F057"/>
+      </w:r>
+      <w:r>
+        <w:t xml:space="preserve">.  </w:t>
+      </w:r>
+      <w:r>
+        <w:t>T</w:t>
+      </w:r>
+      <w:r>
+        <w:t>o achieve Rin &gt; 1M</w:t>
+      </w:r>
+      <w:r>
+        <w:sym w:font="Symbol" w:char="F057"/>
+      </w:r>
+      <w:r>
+        <w:t>, the relatively low 100K</w:t>
+      </w:r>
+      <w:r>
+        <w:sym w:font="Symbol" w:char="F057"/>
+      </w:r>
+      <w:r>
+        <w:t xml:space="preserve"> input resistance of the </w:t>
+      </w:r>
+      <w:r>
+        <w:t>DI-2108 shown in Figure 3</w:t>
+      </w:r>
+      <w:r>
+        <w:t xml:space="preserve"> needs to be increased</w:t>
+      </w:r>
+      <w:r>
+        <w:t xml:space="preserve"> by adding a single supply, follower op amp (LM2902).</w:t>
+      </w:r>
+      <w:r>
+        <w:t xml:space="preserve"> </w:t>
+      </w:r>
     </w:p>
     <w:p>
       <w:pPr>
         <w:pStyle w:val="ListParagraph"/>
-      </w:pPr>
-      <w:r>
-        <w:t>To achieve Rin &gt; 1M</w:t>
-      </w:r>
-      <w:r>
-        <w:sym w:font="Symbol" w:char="F057"/>
-      </w:r>
-      <w:r>
-        <w:t xml:space="preserve">, a LM2902 unity gain, follower circuit will buffer and isolate the DUT from the Analog Input impedance.  </w:t>
-      </w:r>
-      <w:r>
-        <w:t>With maximum signal voltage V</w:t>
-      </w:r>
-      <w:r>
-        <w:rPr>
-          <w:vertAlign w:val="subscript"/>
-        </w:rPr>
-        <w:t>s</w:t>
-      </w:r>
-      <w:r>
-        <w:t xml:space="preserve"> &gt; 16.7V and the maximum input voltage range of the DI-2108 of +/-10.0V, then V</w:t>
-      </w:r>
-      <w:r>
-        <w:rPr>
-          <w:vertAlign w:val="subscript"/>
-        </w:rPr>
-        <w:t>s</w:t>
-      </w:r>
-      <w:r>
-        <w:t xml:space="preserve"> must be scaled to fit within the input range. This accomplished with voltage divider circuit consisting of R</w:t>
-      </w:r>
-      <w:r>
-        <w:t>7 (R9)</w:t>
-      </w:r>
-      <w:r>
-        <w:t xml:space="preserve"> and R</w:t>
-      </w:r>
-      <w:r>
-        <w:t>8 (R10).</w:t>
-      </w:r>
-      <w:r>
-        <w:t xml:space="preserve"> where the parallel resistance (Rin = R</w:t>
-      </w:r>
-      <w:r>
-        <w:t>7</w:t>
-      </w:r>
-      <w:r>
-        <w:t xml:space="preserve"> || R</w:t>
-      </w:r>
-      <w:r>
-        <w:t>9</w:t>
-      </w:r>
-      <w:r>
-        <w:t>) is greater than 1M</w:t>
-      </w:r>
-      <w:r>
-        <w:sym w:font="Symbol" w:char="F057"/>
-      </w:r>
-      <w:r>
-        <w:t xml:space="preserve">.  </w:t>
-      </w:r>
-      <w:r>
-        <w:t>T</w:t>
-      </w:r>
-      <w:r>
-        <w:t>o achieve Rin &gt; 1M</w:t>
-      </w:r>
-      <w:r>
-        <w:sym w:font="Symbol" w:char="F057"/>
-      </w:r>
-      <w:r>
-        <w:t>, the relatively low 100K</w:t>
-      </w:r>
-      <w:r>
-        <w:sym w:font="Symbol" w:char="F057"/>
-      </w:r>
-      <w:r>
-        <w:t xml:space="preserve"> input resistance of the </w:t>
-      </w:r>
-      <w:r>
-        <w:t>DI-2108 shown in Figure 3</w:t>
-      </w:r>
-      <w:r>
-        <w:t xml:space="preserve"> needs to be increased</w:t>
-      </w:r>
-      <w:r>
-        <w:t xml:space="preserve"> by adding a single supply, follower op amp (LM2902).</w:t>
-      </w:r>
-      <w:r>
-        <w:t xml:space="preserve"> </w:t>
-      </w:r>
-    </w:p>
-    <w:p>
-      <w:pPr>
-        <w:pStyle w:val="ListParagraph"/>
+        <w:keepNext/>
       </w:pPr>
       <w:r>
         <w:rPr>
@@ -8465,34 +8689,46 @@
     <w:p>
       <w:pPr>
         <w:pStyle w:val="Caption"/>
-      </w:pPr>
-      <w:r>
-        <w:t>Figure 3.  Analog Input Circuit</w:t>
-      </w:r>
-    </w:p>
-    <w:p>
-      <w:pPr>
-        <w:pStyle w:val="Caption"/>
-      </w:pPr>
-    </w:p>
-    <w:p>
-      <w:pPr>
-        <w:pStyle w:val="Caption"/>
-      </w:pPr>
+        <w:rPr>
+          <w:u w:val="single"/>
+        </w:rPr>
+      </w:pPr>
+      <w:r>
+        <w:t xml:space="preserve">Figure </w:t>
+      </w:r>
+      <w:r>
+        <w:fldChar w:fldCharType="begin"/>
+      </w:r>
+      <w:r>
+        <w:instrText xml:space="preserve"> SEQ Figure \* ARABIC </w:instrText>
+      </w:r>
+      <w:r>
+        <w:fldChar w:fldCharType="separate"/>
+      </w:r>
+      <w:r>
+        <w:rPr>
+          <w:noProof/>
+        </w:rPr>
+        <w:t>6</w:t>
+      </w:r>
+      <w:r>
+        <w:fldChar w:fldCharType="end"/>
+      </w:r>
+      <w:r>
+        <w:t xml:space="preserve">.  </w:t>
+      </w:r>
+      <w:r>
+        <w:t>Analog Input Circuit</w:t>
+      </w:r>
+      <w:r>
+        <w:t xml:space="preserve"> </w:t>
+      </w:r>
       <w:r>
         <w:t>Connector</w:t>
       </w:r>
       <w:r>
         <w:t>s</w:t>
       </w:r>
-    </w:p>
-    <w:p>
-      <w:pPr>
-        <w:spacing w:after="0"/>
-        <w:rPr>
-          <w:u w:val="single"/>
-        </w:rPr>
-      </w:pPr>
       <w:r>
         <w:br w:type="page"/>
       </w:r>
@@ -8517,19 +8753,11 @@
         <w:t xml:space="preserve">The Schematic was captured and the PCB laid out in Easy Cad </w:t>
       </w:r>
       <w:hyperlink r:id="rId14" w:history="1">
-        <w:proofErr w:type="spellStart"/>
         <w:r>
           <w:rPr>
             <w:rStyle w:val="Hyperlink"/>
           </w:rPr>
-          <w:t>EasyEDA</w:t>
-        </w:r>
-        <w:proofErr w:type="spellEnd"/>
-        <w:r>
-          <w:rPr>
-            <w:rStyle w:val="Hyperlink"/>
-          </w:rPr>
-          <w:t xml:space="preserve"> - Online PCB design &amp; circuit simulator</w:t>
+          <w:t>EasyEDA - Online PCB design &amp; circuit simulator</w:t>
         </w:r>
       </w:hyperlink>
     </w:p>
@@ -8537,14 +8765,20 @@
       <w:pPr>
         <w:pStyle w:val="ListParagraph"/>
       </w:pPr>
+    </w:p>
+    <w:p>
+      <w:pPr>
+        <w:pStyle w:val="ListParagraph"/>
+        <w:keepNext/>
+      </w:pPr>
       <w:r>
         <w:rPr>
           <w:noProof/>
         </w:rPr>
         <w:drawing>
-          <wp:inline distT="0" distB="0" distL="0" distR="0" wp14:anchorId="3F3C4B20" wp14:editId="7E337A9C">
-            <wp:extent cx="5143115" cy="3590290"/>
-            <wp:effectExtent l="0" t="0" r="635" b="0"/>
+          <wp:inline distT="0" distB="0" distL="0" distR="0" wp14:anchorId="3F3C4B20" wp14:editId="2C806BC3">
+            <wp:extent cx="4919472" cy="3434170"/>
+            <wp:effectExtent l="0" t="0" r="0" b="0"/>
             <wp:docPr id="665355555" name="Picture 1"/>
             <wp:cNvGraphicFramePr>
               <a:graphicFrameLocks xmlns:a="http://schemas.openxmlformats.org/drawingml/2006/main" noChangeAspect="1"/>
@@ -8565,7 +8799,7 @@
                   <pic:spPr>
                     <a:xfrm>
                       <a:off x="0" y="0"/>
-                      <a:ext cx="5155410" cy="3598873"/>
+                      <a:ext cx="4932856" cy="3443513"/>
                     </a:xfrm>
                     <a:prstGeom prst="rect">
                       <a:avLst/>
@@ -8583,21 +8817,42 @@
         <w:pStyle w:val="Caption"/>
       </w:pPr>
       <w:r>
-        <w:t xml:space="preserve">Interface PCB </w:t>
-      </w:r>
-      <w:proofErr w:type="spellStart"/>
-      <w:r>
-        <w:t>EasyCad</w:t>
-      </w:r>
-      <w:proofErr w:type="spellEnd"/>
-      <w:r>
-        <w:t xml:space="preserve"> Schematic</w:t>
+        <w:t xml:space="preserve">Figure </w:t>
+      </w:r>
+      <w:r>
+        <w:fldChar w:fldCharType="begin"/>
+      </w:r>
+      <w:r>
+        <w:instrText xml:space="preserve"> SEQ Figure \* ARABIC </w:instrText>
+      </w:r>
+      <w:r>
+        <w:fldChar w:fldCharType="separate"/>
+      </w:r>
+      <w:r>
+        <w:rPr>
+          <w:noProof/>
+        </w:rPr>
+        <w:t>7</w:t>
+      </w:r>
+      <w:r>
+        <w:fldChar w:fldCharType="end"/>
+      </w:r>
+      <w:r>
+        <w:t xml:space="preserve">. </w:t>
+      </w:r>
+      <w:r>
+        <w:t>Interface PCB EasyCad Schematic</w:t>
       </w:r>
     </w:p>
     <w:p/>
     <w:p>
       <w:pPr>
-        <w:pStyle w:val="Caption"/>
+        <w:spacing w:after="0"/>
+        <w:rPr>
+          <w:bCs/>
+          <w:noProof/>
+          <w:sz w:val="24"/>
+        </w:rPr>
       </w:pPr>
       <w:bookmarkStart w:id="39" w:name="_Toc191729048"/>
       <w:bookmarkStart w:id="40" w:name="_Toc191729117"/>
@@ -9428,6 +9683,16 @@
         <w:rPr>
           <w:noProof/>
         </w:rPr>
+        <w:br w:type="page"/>
+      </w:r>
+    </w:p>
+    <w:p>
+      <w:pPr>
+        <w:pStyle w:val="Caption"/>
+        <w:keepNext/>
+      </w:pPr>
+      <w:r>
+        <w:lastRenderedPageBreak/>
         <w:drawing>
           <wp:inline distT="0" distB="0" distL="0" distR="0" wp14:anchorId="27700BDC" wp14:editId="7FC68255">
             <wp:extent cx="3584396" cy="3183477"/>
@@ -9480,15 +9745,31 @@
         <w:pStyle w:val="Caption"/>
       </w:pPr>
       <w:r>
-        <w:t xml:space="preserve">Interface PCB </w:t>
-      </w:r>
-      <w:proofErr w:type="spellStart"/>
-      <w:r>
-        <w:t>EasyCad</w:t>
-      </w:r>
-      <w:proofErr w:type="spellEnd"/>
-      <w:r>
-        <w:t xml:space="preserve"> Layout</w:t>
+        <w:t xml:space="preserve">Figure </w:t>
+      </w:r>
+      <w:r>
+        <w:fldChar w:fldCharType="begin"/>
+      </w:r>
+      <w:r>
+        <w:instrText xml:space="preserve"> SEQ Figure \* ARABIC </w:instrText>
+      </w:r>
+      <w:r>
+        <w:fldChar w:fldCharType="separate"/>
+      </w:r>
+      <w:r>
+        <w:rPr>
+          <w:noProof/>
+        </w:rPr>
+        <w:t>8</w:t>
+      </w:r>
+      <w:r>
+        <w:fldChar w:fldCharType="end"/>
+      </w:r>
+      <w:r>
+        <w:t xml:space="preserve">. </w:t>
+      </w:r>
+      <w:r>
+        <w:t>Interface PCB EasyCad Layout</w:t>
       </w:r>
     </w:p>
     <w:p>
@@ -9497,7 +9778,6 @@
       </w:pPr>
       <w:bookmarkStart w:id="451" w:name="_Toc238626481"/>
       <w:r>
-        <w:lastRenderedPageBreak/>
         <w:t>Software Architecture</w:t>
       </w:r>
       <w:bookmarkEnd w:id="451"/>
@@ -9511,6 +9791,7 @@
     <w:p/>
     <w:p>
       <w:pPr>
+        <w:keepNext/>
         <w:widowControl w:val="0"/>
         <w:pBdr>
           <w:top w:val="nil"/>
@@ -9577,6 +9858,30 @@
         <w:pStyle w:val="Caption"/>
       </w:pPr>
       <w:r>
+        <w:t xml:space="preserve">Figure </w:t>
+      </w:r>
+      <w:r>
+        <w:fldChar w:fldCharType="begin"/>
+      </w:r>
+      <w:r>
+        <w:instrText xml:space="preserve"> SEQ Figure \* ARABIC </w:instrText>
+      </w:r>
+      <w:r>
+        <w:fldChar w:fldCharType="separate"/>
+      </w:r>
+      <w:r>
+        <w:rPr>
+          <w:noProof/>
+        </w:rPr>
+        <w:t>9</w:t>
+      </w:r>
+      <w:r>
+        <w:fldChar w:fldCharType="end"/>
+      </w:r>
+      <w:r>
+        <w:t xml:space="preserve">. </w:t>
+      </w:r>
+      <w:r>
         <w:t xml:space="preserve">MLOI </w:t>
       </w:r>
       <w:r>
@@ -9618,13 +9923,14 @@
     <w:p>
       <w:pPr>
         <w:pStyle w:val="Caption"/>
+        <w:keepNext/>
       </w:pPr>
       <w:r>
         <w:rPr>
           <w:noProof/>
         </w:rPr>
         <w:drawing>
-          <wp:inline distT="0" distB="0" distL="0" distR="0" wp14:anchorId="7CC73D88" wp14:editId="692F128F">
+          <wp:inline distT="0" distB="0" distL="0" distR="0" wp14:anchorId="7CC73D88" wp14:editId="10CEE359">
             <wp:extent cx="6041312" cy="3256619"/>
             <wp:effectExtent l="0" t="0" r="2540" b="0"/>
             <wp:docPr id="2007052147" name="Picture 2"/>
@@ -9669,6 +9975,35 @@
           </wp:inline>
         </w:drawing>
       </w:r>
+    </w:p>
+    <w:p>
+      <w:pPr>
+        <w:pStyle w:val="Caption"/>
+      </w:pPr>
+      <w:r>
+        <w:t xml:space="preserve">Figure </w:t>
+      </w:r>
+      <w:r>
+        <w:fldChar w:fldCharType="begin"/>
+      </w:r>
+      <w:r>
+        <w:instrText xml:space="preserve"> SEQ Figure \* ARABIC </w:instrText>
+      </w:r>
+      <w:r>
+        <w:fldChar w:fldCharType="separate"/>
+      </w:r>
+      <w:r>
+        <w:rPr>
+          <w:noProof/>
+        </w:rPr>
+        <w:t>10</w:t>
+      </w:r>
+      <w:r>
+        <w:fldChar w:fldCharType="end"/>
+      </w:r>
+      <w:r>
+        <w:t xml:space="preserve">. </w:t>
+      </w:r>
       <w:r>
         <w:t>MLOI State Transition Diagram</w:t>
       </w:r>
@@ -9723,15 +10058,7 @@
         </w:numPr>
       </w:pPr>
       <w:r>
-        <w:t>Event Loop – Handles user input, remote semaphore and launched Sub VI (</w:t>
-      </w:r>
-      <w:proofErr w:type="spellStart"/>
-      <w:r>
-        <w:t>ie</w:t>
-      </w:r>
-      <w:proofErr w:type="spellEnd"/>
-      <w:r>
-        <w:t xml:space="preserve"> Cal Routines)</w:t>
+        <w:t>Event Loop – Handles user input, remote semaphore and launched Sub VI (ie Cal Routines)</w:t>
       </w:r>
     </w:p>
     <w:p>
@@ -9761,6 +10088,9 @@
       </w:r>
       <w:r>
         <w:t>and Close phases.</w:t>
+      </w:r>
+      <w:r>
+        <w:t xml:space="preserve">  See Figure 11 for the diagram of the LabVIEW Application loops.</w:t>
       </w:r>
     </w:p>
     <w:p/>
@@ -9772,13 +10102,15 @@
     <w:p/>
     <w:p/>
     <w:p>
+      <w:pPr>
+        <w:pStyle w:val="Caption"/>
+      </w:pPr>
       <w:r>
         <w:rPr>
           <w:noProof/>
         </w:rPr>
-        <w:lastRenderedPageBreak/>
         <w:drawing>
-          <wp:inline distT="0" distB="0" distL="0" distR="0" wp14:anchorId="250F5D25" wp14:editId="02B4B276">
+          <wp:inline distT="0" distB="0" distL="0" distR="0" wp14:anchorId="250F5D25" wp14:editId="21609207">
             <wp:extent cx="5943600" cy="3382645"/>
             <wp:effectExtent l="0" t="0" r="0" b="8255"/>
             <wp:docPr id="15364" name="Picture 6">
@@ -9838,6 +10170,36 @@
           </wp:inline>
         </w:drawing>
       </w:r>
+      <w:r>
+        <w:t xml:space="preserve">Figure </w:t>
+      </w:r>
+      <w:r>
+        <w:fldChar w:fldCharType="begin"/>
+      </w:r>
+      <w:r>
+        <w:instrText xml:space="preserve"> SEQ Figure \* ARABIC </w:instrText>
+      </w:r>
+      <w:r>
+        <w:fldChar w:fldCharType="separate"/>
+      </w:r>
+      <w:r>
+        <w:rPr>
+          <w:noProof/>
+        </w:rPr>
+        <w:t>11</w:t>
+      </w:r>
+      <w:r>
+        <w:fldChar w:fldCharType="end"/>
+      </w:r>
+      <w:r>
+        <w:t xml:space="preserve">. </w:t>
+      </w:r>
+      <w:r>
+        <w:t>LabVIEW Application</w:t>
+      </w:r>
+      <w:r>
+        <w:t xml:space="preserve"> Loops</w:t>
+      </w:r>
     </w:p>
     <w:p/>
     <w:p>
@@ -9859,23 +10221,7 @@
         <w:t>GET TEST INFO</w:t>
       </w:r>
       <w:r>
-        <w:t xml:space="preserve">  -- Upon start up the user dialog prompts the user to select the test type by loading the  specified Configuration File and include the Test information </w:t>
-      </w:r>
-      <w:proofErr w:type="spellStart"/>
-      <w:r>
-        <w:t>ie</w:t>
-      </w:r>
-      <w:proofErr w:type="spellEnd"/>
-      <w:r>
-        <w:t xml:space="preserve"> (Job Number, Unit Number, Serial Number,  and set the test parameters Pre or Post pot test, enable pre-fill lubrication phase </w:t>
-      </w:r>
-      <w:proofErr w:type="spellStart"/>
-      <w:r>
-        <w:t>etc</w:t>
-      </w:r>
-      <w:proofErr w:type="spellEnd"/>
-      <w:r>
-        <w:t xml:space="preserve">  for the Device to be testes.  These values are made persistent from Test to Test by being saved to the Windows system Registry.</w:t>
+        <w:t xml:space="preserve">  -- Upon start up the user dialog prompts the user to select the test type by loading the  specified Configuration File and include the Test information ie (Job Number, Unit Number, Serial Number,  and set the test parameters Pre or Post pot test, enable pre-fill lubrication phase etc  for the Device to be testes.  These values are made persistent from Test to Test by being saved to the Windows system Registry.</w:t>
       </w:r>
     </w:p>
     <w:p>
@@ -9887,15 +10233,7 @@
         <w:t>REF FP CONTRL</w:t>
       </w:r>
       <w:r>
-        <w:t xml:space="preserve"> – Reference Front Panel Controls associated the Front </w:t>
-      </w:r>
-      <w:proofErr w:type="spellStart"/>
-      <w:r>
-        <w:t>Planel</w:t>
-      </w:r>
-      <w:proofErr w:type="spellEnd"/>
-      <w:r>
-        <w:t xml:space="preserve"> Control to a Reference Number and initialized the that Control or Indicator.</w:t>
+        <w:t xml:space="preserve"> – Reference Front Panel Controls associated the Front Planel Control to a Reference Number and initialized the that Control or Indicator.</w:t>
       </w:r>
     </w:p>
     <w:p>
@@ -9960,14 +10298,9 @@
       <w:pPr>
         <w:pStyle w:val="ZL3Section"/>
       </w:pPr>
-      <w:proofErr w:type="spellStart"/>
       <w:r>
         <w:lastRenderedPageBreak/>
-        <w:t>DataQ</w:t>
-      </w:r>
-      <w:proofErr w:type="spellEnd"/>
-      <w:r>
-        <w:t xml:space="preserve"> Loop</w:t>
+        <w:t>DataQ Loop</w:t>
       </w:r>
       <w:bookmarkEnd w:id="456"/>
     </w:p>
@@ -10092,23 +10425,7 @@
         <w:ind w:left="1800"/>
       </w:pPr>
       <w:r>
-        <w:t>Run -- where the Level SP is automatically determined by the state defined in the Test Protocol for either of  two test types:  i)  Pre-Pot where level is continuously ramped between Empty, to Full to Empty  aka AEPS Test. ii)  Post Pot where the level is stepped to the switch point for each channel, the resistance is measured and evaluated as Switched (</w:t>
-      </w:r>
-      <w:proofErr w:type="spellStart"/>
-      <w:r>
-        <w:t>ie</w:t>
-      </w:r>
-      <w:proofErr w:type="spellEnd"/>
-      <w:r>
-        <w:t xml:space="preserve"> Pass) or not-Switched (</w:t>
-      </w:r>
-      <w:proofErr w:type="spellStart"/>
-      <w:r>
-        <w:t>ie</w:t>
-      </w:r>
-      <w:proofErr w:type="spellEnd"/>
-      <w:r>
-        <w:t xml:space="preserve"> Fail) aka ATP Test.</w:t>
+        <w:t>Run -- where the Level SP is automatically determined by the state defined in the Test Protocol for either of  two test types:  i)  Pre-Pot where level is continuously ramped between Empty, to Full to Empty  aka AEPS Test. ii)  Post Pot where the level is stepped to the switch point for each channel, the resistance is measured and evaluated as Switched (ie Pass) or not-Switched (ie Fail) aka ATP Test.</w:t>
       </w:r>
     </w:p>
     <w:p>
@@ -10317,6 +10634,7 @@
     </w:p>
     <w:p>
       <w:pPr>
+        <w:keepNext/>
         <w:jc w:val="center"/>
       </w:pPr>
       <w:r>
@@ -10372,6 +10690,35 @@
     </w:p>
     <w:p>
       <w:pPr>
+        <w:pStyle w:val="Caption"/>
+      </w:pPr>
+      <w:r>
+        <w:t xml:space="preserve">Figure </w:t>
+      </w:r>
+      <w:r>
+        <w:fldChar w:fldCharType="begin"/>
+      </w:r>
+      <w:r>
+        <w:instrText xml:space="preserve"> SEQ Figure \* ARABIC </w:instrText>
+      </w:r>
+      <w:r>
+        <w:fldChar w:fldCharType="separate"/>
+      </w:r>
+      <w:r>
+        <w:rPr>
+          <w:noProof/>
+        </w:rPr>
+        <w:t>12</w:t>
+      </w:r>
+      <w:r>
+        <w:fldChar w:fldCharType="end"/>
+      </w:r>
+      <w:r>
+        <w:t>. GIT HUB Diagram</w:t>
+      </w:r>
+    </w:p>
+    <w:p>
+      <w:pPr>
         <w:jc w:val="center"/>
       </w:pPr>
     </w:p>
@@ -10406,7 +10753,7 @@
           <w:noProof/>
         </w:rPr>
         <w:drawing>
-          <wp:inline distT="0" distB="0" distL="0" distR="0" wp14:anchorId="02F3005C" wp14:editId="15F56873">
+          <wp:inline distT="0" distB="0" distL="0" distR="0" wp14:anchorId="02F3005C" wp14:editId="58AA8942">
             <wp:extent cx="6345256" cy="3109595"/>
             <wp:effectExtent l="0" t="0" r="0" b="0"/>
             <wp:docPr id="1713863570" name="Picture 6"/>
@@ -10470,13 +10817,8 @@
         <w:pStyle w:val="ZL3Section"/>
       </w:pPr>
       <w:bookmarkStart w:id="464" w:name="_Toc238626494"/>
-      <w:proofErr w:type="spellStart"/>
-      <w:r>
-        <w:t>PM_Folder</w:t>
-      </w:r>
-      <w:proofErr w:type="spellEnd"/>
-      <w:r>
-        <w:t xml:space="preserve"> Repository</w:t>
+      <w:r>
+        <w:t>PM_Folder Repository</w:t>
       </w:r>
       <w:bookmarkEnd w:id="464"/>
     </w:p>
@@ -10489,7 +10831,7 @@
           <w:noProof/>
         </w:rPr>
         <w:drawing>
-          <wp:inline distT="0" distB="0" distL="0" distR="0" wp14:anchorId="3E546B06" wp14:editId="2946A359">
+          <wp:inline distT="0" distB="0" distL="0" distR="0" wp14:anchorId="3E546B06" wp14:editId="5180E3A8">
             <wp:extent cx="6510996" cy="1424940"/>
             <wp:effectExtent l="0" t="0" r="0" b="3810"/>
             <wp:docPr id="485094610" name="Picture 7"/>
@@ -10576,7 +10918,7 @@
           <w:noProof/>
         </w:rPr>
         <w:drawing>
-          <wp:inline distT="0" distB="0" distL="0" distR="0" wp14:anchorId="7172D5E2" wp14:editId="1029A90A">
+          <wp:inline distT="0" distB="0" distL="0" distR="0" wp14:anchorId="7172D5E2" wp14:editId="06FA75AB">
             <wp:extent cx="5930421" cy="3206115"/>
             <wp:effectExtent l="0" t="0" r="0" b="0"/>
             <wp:docPr id="929968807" name="Picture 8"/>
@@ -10651,7 +10993,13 @@
         <w:t xml:space="preserve">In the Block Diagram view of the LabVIEW development system, </w:t>
       </w:r>
       <w:r>
-        <w:t xml:space="preserve">VI Contextual Help is available for each VI function block when enabled.  </w:t>
+        <w:t>VI Contextual Help is available for each VI function block when enabled</w:t>
+      </w:r>
+      <w:r>
+        <w:t xml:space="preserve"> (see Figure 13)</w:t>
+      </w:r>
+      <w:r>
+        <w:t xml:space="preserve">.  </w:t>
       </w:r>
       <w:r>
         <w:t>Clicking on a VI function block displays a description of the VI function, terminal names and indicates their data type of the function parameters.</w:t>
@@ -10659,6 +11007,7 @@
     </w:p>
     <w:p>
       <w:pPr>
+        <w:keepNext/>
         <w:jc w:val="center"/>
       </w:pPr>
       <w:r>
@@ -10717,6 +11066,30 @@
         <w:pStyle w:val="Caption"/>
       </w:pPr>
       <w:r>
+        <w:t xml:space="preserve">Figure </w:t>
+      </w:r>
+      <w:r>
+        <w:fldChar w:fldCharType="begin"/>
+      </w:r>
+      <w:r>
+        <w:instrText xml:space="preserve"> SEQ Figure \* ARABIC </w:instrText>
+      </w:r>
+      <w:r>
+        <w:fldChar w:fldCharType="separate"/>
+      </w:r>
+      <w:r>
+        <w:rPr>
+          <w:noProof/>
+        </w:rPr>
+        <w:t>13</w:t>
+      </w:r>
+      <w:r>
+        <w:fldChar w:fldCharType="end"/>
+      </w:r>
+      <w:r>
+        <w:t xml:space="preserve">. </w:t>
+      </w:r>
+      <w:r>
         <w:t>Example of VI Contextual Help</w:t>
       </w:r>
     </w:p>
@@ -10883,13 +11256,14 @@
       <w:r>
         <w:t xml:space="preserve">treamlined branching </w:t>
       </w:r>
-      <w:proofErr w:type="spellStart"/>
-      <w:r>
-        <w:t>Github</w:t>
-      </w:r>
-      <w:proofErr w:type="spellEnd"/>
-      <w:r>
-        <w:t xml:space="preserve"> Flow strategy shall be used. </w:t>
+      <w:r>
+        <w:t>Github Flow strategy shall be used</w:t>
+      </w:r>
+      <w:r>
+        <w:t xml:space="preserve"> (see Figure 14)</w:t>
+      </w:r>
+      <w:r>
+        <w:t xml:space="preserve">. </w:t>
       </w:r>
     </w:p>
     <w:p>
@@ -10984,11 +11358,8 @@
     </w:p>
     <w:p>
       <w:pPr>
+        <w:keepNext/>
         <w:jc w:val="center"/>
-        <w:rPr>
-          <w:b/>
-          <w:bCs/>
-        </w:rPr>
       </w:pPr>
       <w:r>
         <w:rPr>
@@ -11045,11 +11416,36 @@
     </w:p>
     <w:p>
       <w:pPr>
+        <w:pStyle w:val="Caption"/>
         <w:rPr>
           <w:b/>
-          <w:bCs/>
-        </w:rPr>
-      </w:pPr>
+          <w:bCs w:val="0"/>
+        </w:rPr>
+      </w:pPr>
+      <w:r>
+        <w:t xml:space="preserve">Figure </w:t>
+      </w:r>
+      <w:r>
+        <w:fldChar w:fldCharType="begin"/>
+      </w:r>
+      <w:r>
+        <w:instrText xml:space="preserve"> SEQ Figure \* ARABIC </w:instrText>
+      </w:r>
+      <w:r>
+        <w:fldChar w:fldCharType="separate"/>
+      </w:r>
+      <w:r>
+        <w:rPr>
+          <w:noProof/>
+        </w:rPr>
+        <w:t>14</w:t>
+      </w:r>
+      <w:r>
+        <w:fldChar w:fldCharType="end"/>
+      </w:r>
+      <w:r>
+        <w:t>. GIT HUB Flow Strategy for MLOI Test Project</w:t>
+      </w:r>
     </w:p>
     <w:p>
       <w:pPr>
@@ -11144,21 +11540,7 @@
         <w:rPr>
           <w:rFonts w:ascii="Courier New" w:hAnsi="Courier New" w:cs="Courier New"/>
         </w:rPr>
-        <w:t xml:space="preserve">git config --global </w:t>
-      </w:r>
-      <w:proofErr w:type="spellStart"/>
-      <w:r>
-        <w:rPr>
-          <w:rFonts w:ascii="Courier New" w:hAnsi="Courier New" w:cs="Courier New"/>
-        </w:rPr>
-        <w:t>user.email</w:t>
-      </w:r>
-      <w:proofErr w:type="spellEnd"/>
-      <w:r>
-        <w:rPr>
-          <w:rFonts w:ascii="Courier New" w:hAnsi="Courier New" w:cs="Courier New"/>
-        </w:rPr>
-        <w:t xml:space="preserve"> "your.email@example.com"</w:t>
+        <w:t>git config --global user.email "your.email@example.com"</w:t>
       </w:r>
     </w:p>
     <w:p>
@@ -11254,16 +11636,8 @@
         <w:rPr>
           <w:rFonts w:ascii="Courier New" w:hAnsi="Courier New" w:cs="Courier New"/>
         </w:rPr>
-        <w:t xml:space="preserve">git </w:t>
-      </w:r>
-      <w:proofErr w:type="spellStart"/>
-      <w:r>
-        <w:rPr>
-          <w:rFonts w:ascii="Courier New" w:hAnsi="Courier New" w:cs="Courier New"/>
-        </w:rPr>
-        <w:t>init</w:t>
-      </w:r>
-      <w:proofErr w:type="spellEnd"/>
+        <w:t>git init</w:t>
+      </w:r>
     </w:p>
     <w:p>
       <w:pPr>
@@ -11400,21 +11774,7 @@
         <w:rPr>
           <w:rFonts w:ascii="Courier New" w:hAnsi="Courier New" w:cs="Courier New"/>
         </w:rPr>
-        <w:t>git remote set-</w:t>
-      </w:r>
-      <w:proofErr w:type="spellStart"/>
-      <w:r>
-        <w:rPr>
-          <w:rFonts w:ascii="Courier New" w:hAnsi="Courier New" w:cs="Courier New"/>
-        </w:rPr>
-        <w:t>url</w:t>
-      </w:r>
-      <w:proofErr w:type="spellEnd"/>
-      <w:r>
-        <w:rPr>
-          <w:rFonts w:ascii="Courier New" w:hAnsi="Courier New" w:cs="Courier New"/>
-        </w:rPr>
-        <w:t xml:space="preserve"> origin</w:t>
+        <w:t>git remote set-url origin</w:t>
       </w:r>
       <w:r>
         <w:rPr>
@@ -11593,15 +11953,7 @@
         <w:contextualSpacing/>
       </w:pPr>
       <w:r>
-        <w:t>Open a command window by typing “</w:t>
-      </w:r>
-      <w:proofErr w:type="spellStart"/>
-      <w:r>
-        <w:t>cmd</w:t>
-      </w:r>
-      <w:proofErr w:type="spellEnd"/>
-      <w:r>
-        <w:t>” into the Search bar.</w:t>
+        <w:t>Open a command window by typing “cmd” into the Search bar.</w:t>
       </w:r>
     </w:p>
     <w:p>
@@ -11684,6 +12036,7 @@
     </w:p>
     <w:p>
       <w:pPr>
+        <w:keepNext/>
         <w:widowControl w:val="0"/>
         <w:pBdr>
           <w:top w:val="nil"/>
@@ -11692,6 +12045,7 @@
           <w:right w:val="nil"/>
           <w:between w:val="nil"/>
         </w:pBdr>
+        <w:jc w:val="center"/>
       </w:pPr>
       <w:r>
         <w:rPr>
@@ -11732,6 +12086,35 @@
             </a:graphic>
           </wp:inline>
         </w:drawing>
+      </w:r>
+    </w:p>
+    <w:p>
+      <w:pPr>
+        <w:pStyle w:val="Caption"/>
+      </w:pPr>
+      <w:r>
+        <w:t xml:space="preserve">Figure </w:t>
+      </w:r>
+      <w:r>
+        <w:fldChar w:fldCharType="begin"/>
+      </w:r>
+      <w:r>
+        <w:instrText xml:space="preserve"> SEQ Figure \* ARABIC </w:instrText>
+      </w:r>
+      <w:r>
+        <w:fldChar w:fldCharType="separate"/>
+      </w:r>
+      <w:r>
+        <w:rPr>
+          <w:noProof/>
+        </w:rPr>
+        <w:t>15</w:t>
+      </w:r>
+      <w:r>
+        <w:fldChar w:fldCharType="end"/>
+      </w:r>
+      <w:r>
+        <w:t>. Command Window</w:t>
       </w:r>
     </w:p>
     <w:p>
@@ -12018,17 +12401,7 @@
         <w:contextualSpacing/>
       </w:pPr>
       <w:r>
-        <w:t xml:space="preserve">Link the Project Item </w:t>
-      </w:r>
-      <w:proofErr w:type="spellStart"/>
-      <w:proofErr w:type="gramStart"/>
-      <w:r>
-        <w:t>it’s</w:t>
-      </w:r>
-      <w:proofErr w:type="spellEnd"/>
-      <w:proofErr w:type="gramEnd"/>
-      <w:r>
-        <w:t xml:space="preserve"> Destination Folder.</w:t>
+        <w:t>Link the Project Item it’s Destination Folder.</w:t>
       </w:r>
     </w:p>
     <w:p>
@@ -12422,11 +12795,17 @@
       <w:r>
         <w:t xml:space="preserve">Open </w:t>
       </w:r>
+      <w:r>
+        <w:t>“</w:t>
+      </w:r>
       <w:proofErr w:type="spellStart"/>
       <w:r>
         <w:t>Cmd</w:t>
       </w:r>
       <w:proofErr w:type="spellEnd"/>
+      <w:r>
+        <w:t>”</w:t>
+      </w:r>
       <w:r>
         <w:t xml:space="preserve"> window to upload the build to GitHub</w:t>
       </w:r>
@@ -12481,6 +12860,10 @@
       </w:pPr>
     </w:p>
     <w:p>
+      <w:pPr>
+        <w:keepNext/>
+        <w:jc w:val="center"/>
+      </w:pPr>
       <w:r>
         <w:rPr>
           <w:noProof/>
@@ -12535,6 +12918,35 @@
     </w:p>
     <w:p>
       <w:pPr>
+        <w:pStyle w:val="Caption"/>
+      </w:pPr>
+      <w:r>
+        <w:t xml:space="preserve">Figure </w:t>
+      </w:r>
+      <w:r>
+        <w:fldChar w:fldCharType="begin"/>
+      </w:r>
+      <w:r>
+        <w:instrText xml:space="preserve"> SEQ Figure \* ARABIC </w:instrText>
+      </w:r>
+      <w:r>
+        <w:fldChar w:fldCharType="separate"/>
+      </w:r>
+      <w:r>
+        <w:rPr>
+          <w:noProof/>
+        </w:rPr>
+        <w:t>16</w:t>
+      </w:r>
+      <w:r>
+        <w:fldChar w:fldCharType="end"/>
+      </w:r>
+      <w:r>
+        <w:t>. Command Window</w:t>
+      </w:r>
+    </w:p>
+    <w:p>
+      <w:pPr>
         <w:pStyle w:val="ZL2Section"/>
       </w:pPr>
       <w:bookmarkStart w:id="486" w:name="_Toc196746839"/>
@@ -12554,25 +12966,15 @@
           <w:rPr>
             <w:rStyle w:val="Hyperlink"/>
           </w:rPr>
-          <w:t xml:space="preserve">GitHub - </w:t>
-        </w:r>
-        <w:proofErr w:type="spellStart"/>
-        <w:r>
-          <w:rPr>
-            <w:rStyle w:val="Hyperlink"/>
-          </w:rPr>
-          <w:t>AllenAircraft</w:t>
-        </w:r>
-        <w:proofErr w:type="spellEnd"/>
-        <w:r>
-          <w:rPr>
-            <w:rStyle w:val="Hyperlink"/>
-          </w:rPr>
-          <w:t>/PWC-OLS</w:t>
+          <w:t>GitHub - AllenAircraft/PWC-OLS</w:t>
         </w:r>
       </w:hyperlink>
       <w:r>
-        <w:t xml:space="preserve">  The easiest way to download the LV app is to download the project as a zip file and extract the MLOI-OLS LV Tester folder to the target PC desktop.  Perform the following steps on the Test target PC.</w:t>
+        <w:t xml:space="preserve">  The easiest way to download the LV app is to download the project as </w:t>
+      </w:r>
+      <w:r>
+        <w:lastRenderedPageBreak/>
+        <w:t>a zip file and extract the MLOI-OLS LV Tester folder to the target PC desktop.  Perform the following steps on the Test target PC.</w:t>
       </w:r>
     </w:p>
     <w:p>
@@ -12590,7 +12992,6 @@
         <w:contextualSpacing/>
       </w:pPr>
       <w:r>
-        <w:lastRenderedPageBreak/>
         <w:t xml:space="preserve">Use an internet browser to navigate to </w:t>
       </w:r>
       <w:r>
@@ -12614,15 +13015,7 @@
         <w:contextualSpacing/>
       </w:pPr>
       <w:r>
-        <w:t xml:space="preserve">Select the Version of the project to be downloaded.  Note that Main is the latest Version released. Other </w:t>
-      </w:r>
-      <w:proofErr w:type="gramStart"/>
-      <w:r>
-        <w:t>version</w:t>
-      </w:r>
-      <w:proofErr w:type="gramEnd"/>
-      <w:r>
-        <w:t xml:space="preserve"> are either archives or under evaluation.  In this example Q02 is shown, so Main is the previous version Q01. See Versioning control. </w:t>
+        <w:t xml:space="preserve">Select the Version of the project to be downloaded.  Note that Main is the latest Version released. Other version are either archives or under evaluation.  In this example Q02 is shown, so Main is the previous version Q01. See Versioning control. </w:t>
       </w:r>
     </w:p>
     <w:p>
@@ -12844,15 +13237,7 @@
         <w:contextualSpacing/>
       </w:pPr>
       <w:r>
-        <w:t xml:space="preserve">Right click in the white space, pick “Open in </w:t>
-      </w:r>
-      <w:proofErr w:type="spellStart"/>
-      <w:r>
-        <w:t>Termimal</w:t>
-      </w:r>
-      <w:proofErr w:type="spellEnd"/>
-      <w:r>
-        <w:t>,;</w:t>
+        <w:t>Right click in the white space, pick “Open in Termimal,;</w:t>
       </w:r>
     </w:p>
     <w:p/>
@@ -12896,15 +13281,8 @@
     </w:p>
     <w:p>
       <w:r>
-        <w:t xml:space="preserve">Browse to GitHub </w:t>
-      </w:r>
-      <w:proofErr w:type="gramStart"/>
-      <w:r>
-        <w:t>Repository, and</w:t>
-      </w:r>
-      <w:proofErr w:type="gramEnd"/>
-      <w:r>
-        <w:t xml:space="preserve"> copy the link under green Code button.  Clone the project by pasting the copied link into the clone command.</w:t>
+        <w:lastRenderedPageBreak/>
+        <w:t>Browse to GitHub Repository, and copy the link under green Code button.  Clone the project by pasting the copied link into the clone command.</w:t>
       </w:r>
     </w:p>
     <w:p>
@@ -12936,7 +13314,6 @@
         <w:pStyle w:val="ComputerCmds"/>
       </w:pPr>
       <w:r>
-        <w:lastRenderedPageBreak/>
         <w:t>Cloning into 'MLOI-OLS'...</w:t>
       </w:r>
     </w:p>
@@ -13077,13 +13454,8 @@
         <w:pStyle w:val="ComputerCmds"/>
       </w:pPr>
       <w:r>
-        <w:t xml:space="preserve">$ git </w:t>
-      </w:r>
-      <w:proofErr w:type="gramStart"/>
-      <w:r>
-        <w:t>remote -v</w:t>
-      </w:r>
-      <w:proofErr w:type="gramEnd"/>
+        <w:t>$ git remote -v</w:t>
+      </w:r>
     </w:p>
     <w:p>
       <w:pPr>
@@ -13111,13 +13483,8 @@
     </w:p>
     <w:p/>
     <w:p>
-      <w:proofErr w:type="gramStart"/>
-      <w:r>
-        <w:t>To see</w:t>
-      </w:r>
-      <w:proofErr w:type="gramEnd"/>
-      <w:r>
-        <w:t xml:space="preserve"> the current local branch</w:t>
+      <w:r>
+        <w:t>To see the current local branch</w:t>
       </w:r>
     </w:p>
     <w:p>
@@ -13186,6 +13553,7 @@
         <w:pStyle w:val="ComputerCmds"/>
       </w:pPr>
       <w:r>
+        <w:lastRenderedPageBreak/>
         <w:t>...</w:t>
       </w:r>
     </w:p>
@@ -13215,7 +13583,6 @@
     </w:p>
     <w:p>
       <w:r>
-        <w:lastRenderedPageBreak/>
         <w:t xml:space="preserve">To </w:t>
       </w:r>
       <w:r>
@@ -13276,15 +13643,7 @@
     <w:p/>
     <w:p>
       <w:r>
-        <w:t xml:space="preserve">The branches that start with remotes/* can be thought of as read only copies of the remote branches. To work on a </w:t>
-      </w:r>
-      <w:proofErr w:type="gramStart"/>
-      <w:r>
-        <w:t>branch</w:t>
-      </w:r>
-      <w:proofErr w:type="gramEnd"/>
-      <w:r>
-        <w:t xml:space="preserve"> you need to create a local branch from it. This is done with the Git command switch giving it the name of the remote branch </w:t>
+        <w:t xml:space="preserve">The branches that start with remotes/* can be thought of as read only copies of the remote branches. To work on a branch you need to create a local branch from it. This is done with the Git command switch giving it the name of the remote branch </w:t>
       </w:r>
     </w:p>
     <w:p/>
@@ -13455,15 +13814,7 @@
         <w:pStyle w:val="ComputerCmds"/>
       </w:pPr>
       <w:r>
-        <w:t xml:space="preserve">    Removed all vi within Allen Projects folder, only mXXX.vi and </w:t>
-      </w:r>
-      <w:proofErr w:type="spellStart"/>
-      <w:r>
-        <w:t>defs</w:t>
-      </w:r>
-      <w:proofErr w:type="spellEnd"/>
-      <w:r>
-        <w:t xml:space="preserve"> remain</w:t>
+        <w:t xml:space="preserve">    Removed all vi within Allen Projects folder, only mXXX.vi and defs remain</w:t>
       </w:r>
     </w:p>
     <w:p>
@@ -13490,7 +13841,6 @@
     <w:p/>
     <w:p>
       <w:r>
-        <w:lastRenderedPageBreak/>
         <w:t>Switching to a different commit, detached the pointer from the head as it now points to the requested commit.  There are two ways to switch back to the head</w:t>
       </w:r>
     </w:p>
@@ -13594,15 +13944,7 @@
         <w:pStyle w:val="ComputerCmds"/>
       </w:pPr>
       <w:r>
-        <w:t xml:space="preserve">        builds/PWC-OLS/$</w:t>
-      </w:r>
-      <w:proofErr w:type="spellStart"/>
-      <w:r>
-        <w:t>ConfigFiles</w:t>
-      </w:r>
-      <w:proofErr w:type="spellEnd"/>
-      <w:r>
-        <w:t>/8005571-05 Elevate OLS .csv</w:t>
+        <w:t xml:space="preserve">        builds/PWC-OLS/$ConfigFiles/8005571-05 Elevate OLS .csv</w:t>
       </w:r>
     </w:p>
     <w:p>
@@ -13676,15 +14018,7 @@
         <w:pStyle w:val="ComputerCmds"/>
       </w:pPr>
       <w:r>
-        <w:t xml:space="preserve">$ </w:t>
-      </w:r>
-      <w:proofErr w:type="gramStart"/>
-      <w:r>
-        <w:t>git</w:t>
-      </w:r>
-      <w:proofErr w:type="gramEnd"/>
-      <w:r>
-        <w:t xml:space="preserve"> restore *</w:t>
+        <w:t>$ git restore *</w:t>
       </w:r>
     </w:p>
     <w:p>
@@ -13729,6 +14063,7 @@
         <w:pStyle w:val="ComputerCmds"/>
       </w:pPr>
       <w:r>
+        <w:lastRenderedPageBreak/>
         <w:t>$ git branch</w:t>
       </w:r>
     </w:p>
@@ -13775,23 +14110,7 @@
     <w:p/>
     <w:p>
       <w:r>
-        <w:t xml:space="preserve">Starting </w:t>
-      </w:r>
-      <w:proofErr w:type="spellStart"/>
-      <w:r>
-        <w:t>fron</w:t>
-      </w:r>
-      <w:proofErr w:type="spellEnd"/>
-      <w:r>
-        <w:t xml:space="preserve"> an </w:t>
-      </w:r>
-      <w:proofErr w:type="spellStart"/>
-      <w:r>
-        <w:t>exixting</w:t>
-      </w:r>
-      <w:proofErr w:type="spellEnd"/>
-      <w:r>
-        <w:t xml:space="preserve"> branch</w:t>
+        <w:t>Starting fron an exixting branch</w:t>
       </w:r>
     </w:p>
     <w:p/>
@@ -14055,15 +14374,7 @@
     <w:p/>
     <w:p>
       <w:r>
-        <w:t xml:space="preserve">Copy and Paste the following command into power shell, then change the “x” to </w:t>
-      </w:r>
-      <w:proofErr w:type="spellStart"/>
-      <w:r>
-        <w:t>what ever</w:t>
-      </w:r>
-      <w:proofErr w:type="spellEnd"/>
-      <w:r>
-        <w:t xml:space="preserve"> text to want to prepend to all the file names in the directory.</w:t>
+        <w:t>Copy and Paste the following command into power shell, then change the “x” to what ever text to want to prepend to all the file names in the directory.</w:t>
       </w:r>
     </w:p>
     <w:p/>
@@ -14080,23 +14391,7 @@
         <w:pStyle w:val="ComputerCmds"/>
       </w:pPr>
       <w:r>
-        <w:t>$ (Get-</w:t>
-      </w:r>
-      <w:proofErr w:type="spellStart"/>
-      <w:r>
-        <w:t>ChildItem</w:t>
-      </w:r>
-      <w:proofErr w:type="spellEnd"/>
-      <w:r>
-        <w:t xml:space="preserve"> -File) | Rename-Item -</w:t>
-      </w:r>
-      <w:proofErr w:type="spellStart"/>
-      <w:r>
-        <w:t>NewName</w:t>
-      </w:r>
-      <w:proofErr w:type="spellEnd"/>
-      <w:r>
-        <w:t xml:space="preserve"> {$_.Name -replace "^","x"}</w:t>
+        <w:t>$ (Get-ChildItem -File) | Rename-Item -NewName {$_.Name -replace "^","x"}</w:t>
       </w:r>
     </w:p>
     <w:p>
@@ -14104,13 +14399,8 @@
         <w:pStyle w:val="ComputerCmds"/>
       </w:pPr>
       <w:r>
-        <w:t xml:space="preserve">$ </w:t>
-      </w:r>
-      <w:proofErr w:type="spellStart"/>
-      <w:r>
-        <w:t>dir</w:t>
-      </w:r>
-      <w:proofErr w:type="spellEnd"/>
+        <w:t>$ dir</w:t>
+      </w:r>
     </w:p>
     <w:p>
       <w:pPr>
@@ -14130,15 +14420,7 @@
         <w:pStyle w:val="ComputerCmds"/>
       </w:pPr>
       <w:r>
-        <w:t xml:space="preserve">Mode                 </w:t>
-      </w:r>
-      <w:proofErr w:type="spellStart"/>
-      <w:r>
-        <w:t>LastWriteTime</w:t>
-      </w:r>
-      <w:proofErr w:type="spellEnd"/>
-      <w:r>
-        <w:t xml:space="preserve">         Length Name</w:t>
+        <w:t>Mode                 LastWriteTime         Length Name</w:t>
       </w:r>
     </w:p>
     <w:p>
@@ -14170,37 +14452,13 @@
         <w:pStyle w:val="ComputerCmds"/>
       </w:pPr>
       <w:r>
-        <w:t xml:space="preserve">-a----         4/26/2025   6:35 AM          17868 </w:t>
-      </w:r>
-      <w:proofErr w:type="spellStart"/>
-      <w:r>
-        <w:t>x$CTL_Limit</w:t>
-      </w:r>
-      <w:proofErr w:type="spellEnd"/>
-      <w:r>
-        <w:t xml:space="preserve"> Check.vi</w:t>
+        <w:t>-a----         4/26/2025   6:35 AM          17868 x$CTL_Limit Check.vi</w:t>
       </w:r>
     </w:p>
     <w:p/>
     <w:p>
       <w:r>
-        <w:t>(Get-</w:t>
-      </w:r>
-      <w:proofErr w:type="spellStart"/>
-      <w:r>
-        <w:t>ChildItem</w:t>
-      </w:r>
-      <w:proofErr w:type="spellEnd"/>
-      <w:r>
-        <w:t xml:space="preserve"> -File) | Rename-Item -</w:t>
-      </w:r>
-      <w:proofErr w:type="spellStart"/>
-      <w:r>
-        <w:t>NewName</w:t>
-      </w:r>
-      <w:proofErr w:type="spellEnd"/>
-      <w:r>
-        <w:t xml:space="preserve"> {$_.Name -replace "^","x"}</w:t>
+        <w:t>(Get-ChildItem -File) | Rename-Item -NewName {$_.Name -replace "^","x"}</w:t>
       </w:r>
     </w:p>
     <w:p/>
@@ -14284,7 +14542,7 @@
         <w:noProof/>
         <w:sz w:val="22"/>
       </w:rPr>
-      <w:object w:dxaOrig="1822" w:dyaOrig="408" w14:anchorId="7707EBDF">
+      <w:object w:dxaOrig="1440" w:dyaOrig="1440" w14:anchorId="7707EBDF">
         <v:shapetype id="_x0000_t75" coordsize="21600,21600" o:spt="75" o:preferrelative="t" path="m@4@5l@4@11@9@11@9@5xe" filled="f" stroked="f">
           <v:stroke joinstyle="miter"/>
           <v:formulas>
@@ -14308,7 +14566,7 @@
           <v:imagedata r:id="rId1" o:title="" croptop="-1938f" cropbottom="-1938f" cropleft="-1320f" cropright="-1320f"/>
           <w10:wrap type="topAndBottom"/>
         </v:shape>
-        <o:OLEObject Type="Embed" ProgID="Word.Picture.8" ShapeID="_x0000_s1025" DrawAspect="Content" ObjectID="_1849323993" r:id="rId2"/>
+        <o:OLEObject Type="Embed" ProgID="Word.Picture.8" ShapeID="_x0000_s1025" DrawAspect="Content" ObjectID="_1849865492" r:id="rId2"/>
       </w:object>
     </w:r>
     <w:r>
@@ -14595,7 +14853,7 @@
         <w:noProof/>
         <w:sz w:val="22"/>
       </w:rPr>
-      <w:object w:dxaOrig="1822" w:dyaOrig="408" w14:anchorId="53683FE0">
+      <w:object w:dxaOrig="1440" w:dyaOrig="1440" w14:anchorId="53683FE0">
         <v:shapetype id="_x0000_t75" coordsize="21600,21600" o:spt="75" o:preferrelative="t" path="m@4@5l@4@11@9@11@9@5xe" filled="f" stroked="f">
           <v:stroke joinstyle="miter"/>
           <v:formulas>
@@ -14619,7 +14877,7 @@
           <v:imagedata r:id="rId1" o:title="" croptop="-1938f" cropbottom="-1938f" cropleft="-1320f" cropright="-1320f"/>
           <w10:wrap type="topAndBottom"/>
         </v:shape>
-        <o:OLEObject Type="Embed" ProgID="Word.Picture.8" ShapeID="_x0000_s1088" DrawAspect="Content" ObjectID="_1849323994" r:id="rId2"/>
+        <o:OLEObject Type="Embed" ProgID="Word.Picture.8" ShapeID="_x0000_s1088" DrawAspect="Content" ObjectID="_1849865493" r:id="rId2"/>
       </w:object>
     </w:r>
     <w:r>
@@ -17841,15 +18099,14 @@
     <w:basedOn w:val="Normal"/>
     <w:next w:val="Normal"/>
     <w:qFormat/>
-    <w:rsid w:val="000D27C4"/>
+    <w:rsid w:val="007E3CA5"/>
     <w:pPr>
-      <w:spacing w:before="120"/>
+      <w:spacing w:before="240"/>
       <w:jc w:val="center"/>
     </w:pPr>
     <w:rPr>
-      <w:b/>
       <w:bCs/>
-      <w:sz w:val="20"/>
+      <w:sz w:val="24"/>
     </w:rPr>
   </w:style>
   <w:style w:type="paragraph" w:customStyle="1" w:styleId="STYLE7">
@@ -17992,15 +18249,18 @@
     <w:basedOn w:val="TableofFigures"/>
     <w:link w:val="AllenFiguresChar"/>
     <w:qFormat/>
-    <w:rsid w:val="0039057D"/>
+    <w:rsid w:val="007E3CA5"/>
     <w:pPr>
       <w:tabs>
         <w:tab w:val="right" w:leader="dot" w:pos="9350"/>
       </w:tabs>
+      <w:spacing w:before="240"/>
+      <w:jc w:val="center"/>
     </w:pPr>
     <w:rPr>
       <w:smallCaps/>
       <w:noProof/>
+      <w:sz w:val="24"/>
     </w:rPr>
   </w:style>
   <w:style w:type="paragraph" w:customStyle="1" w:styleId="Allen-Tables">
@@ -18034,7 +18294,7 @@
   <w:style w:type="character" w:customStyle="1" w:styleId="AllenFiguresChar">
     <w:name w:val="Allen Figures Char"/>
     <w:link w:val="AllenFigures"/>
-    <w:rsid w:val="0039057D"/>
+    <w:rsid w:val="007E3CA5"/>
     <w:rPr>
       <w:rFonts w:ascii="Arial" w:hAnsi="Arial"/>
       <w:smallCaps/>

</xml_diff>